<commit_message>
docs(p7): mirror G2 rewrite into VI manuscript; rebuild both DOCX
Brings the Vietnamese manuscript fully in line with the English G2 version:
geographical-Asia (UN M49) scope rationale, N=82,302 / 45 economies / 98 waves,
all regenerated coefficients and turning points, revised H4 (FSTS×manager NS)
and H5 (concavity deepens, not monotonic peak migration), new §4.8
multidimensional-performance robustness, WBES sampling detail, and four added
APA-7 references (Combs 2005; Richard 2009; UNSD 2024; World Bank 2022). Also
corrects the residual "48 ICRV-mapped economies" to 45 in both EN and VI.
Rebuilt EN and VN submission DOCX.

https://claude.ai/code/session_01TNqoRFY1vAVQL6GWg8X9M3
</commit_message>
<xml_diff>
--- a/dist/submission/p7_capstone_VN.docx
+++ b/dist/submission/p7_capstone_VN.docx
@@ -2,13 +2,13 @@
 <file path=word/document.xml><?xml version="1.0" encoding="utf-8"?>
 <w:document xmlns:w="http://schemas.openxmlformats.org/wordprocessingml/2006/main" xmlns:m="http://schemas.openxmlformats.org/officeDocument/2006/math" xmlns:r="http://schemas.openxmlformats.org/officeDocument/2006/relationships" xmlns:o="urn:schemas-microsoft-com:office:office" xmlns:v="urn:schemas-microsoft-com:vml" xmlns:w10="urn:schemas-microsoft-com:office:word" xmlns:a="http://schemas.openxmlformats.org/drawingml/2006/main" xmlns:pic="http://schemas.openxmlformats.org/drawingml/2006/picture" xmlns:wp="http://schemas.openxmlformats.org/drawingml/2006/wordprocessingDrawing">
   <w:body>
-    <w:bookmarkStart w:id="55" w:name="X580f7a07cbc3f53dbef3c88240a0ce7e6a60b02"/>
+    <w:bookmarkStart w:id="56" w:name="X6403fd954d28f4f635f4ec585f1995edb070610"/>
     <w:p>
       <w:pPr>
         <w:pStyle w:val="Heading1"/>
       </w:pPr>
       <w:r>
-        <w:t xml:space="preserve">Quốc Tế Hóa Sinh Lợi ở Đâu: Chế Độ Thể Chế và Năng Lực Số như Những Nhân Tố Đồng Xác Định Điểm Tối Ưu Hiệu Quả trên 49 Nền Kinh Tế Châu Á và Thái Bình Dương</w:t>
+        <w:t xml:space="preserve">Quốc Tế Hóa Sinh Lợi ở Đâu: Chế Độ Thể Chế và Năng Lực Số như Những Nhân Tố Đồng Xác Định Điểm Tối Ưu Hiệu Quả trên 45 Nền Kinh Tế Châu Á và Thái Bình Dương</w:t>
       </w:r>
     </w:p>
     <w:p>
@@ -195,7 +195,7 @@
         <w:t xml:space="preserve"> </w:t>
       </w:r>
       <w:r>
-        <w:t xml:space="preserve">(substitute) một phần cho sức mạnh thể chế chứ không phải một nhân tố nâng cao đồng đều. Sử dụng vi dữ liệu được chuẩn hóa từ 91.982 quan sát doanh nghiệp (mẫu ước lượng cơ sở N = 84.910 sau khi áp dụng yêu cầu không thiếu về năng suất và cường độ xuất khẩu; 29.840 ở mô hình đầy đủ) tại 48 nền kinh tế và 107 đợt khảo sát quốc gia-năm thuộc Khảo sát Doanh nghiệp Thế giới (World Bank Enterprise Survey — WBES) giai đoạn 2003–2025, bao trùm cả sáu nhóm thuộc khung Năng lực Thể chế và Tổn thương Nguồn lực (Institutional Context Regime Variation — ICRV), nghiên cứu này ước lượng một chuỗi mô hình phân cấp (hierarchical model) sử dụng OLS với sai số chuẩn vững HC1. Kết quả xác nhận mối quan hệ I–P hình chữ U ngược một cách vững chắc, với điểm ngưỡng ở khoảng 36% doanh số từ xuất khẩu (kiểm định Lind–Mehlum p &lt; ,001; được xác nhận trong M11 với TP = 34,6%, p = ,002). Chế độ thể chế tái định vị có hệ thống điểm tối ưu này: cường độ xuất khẩu tối đa hóa hiệu quả dịch chuyển từ đạt đỉnh sớm ở các chế độ tiên tiến sang đạt đỉnh muộn ở các chế độ tiên phong và dễ tổn thương. Chỉ số áp dụng số (Digital Adoption Index — DAI) vừa nâng cao mức hiệu quả vừa tái tạo đường cong — nén lợi nhuận nhánh lên ở mức FSTS thấp và làm dịu sự suy giảm hiệu quả ở mức FSTS cao (FSTS×DAI p &lt; ,01; FSTS²×DAI p &lt; ,01 trong M8–M9) — và năng lực tái tạo đường cong này mạnh hơn đáng kể ở các chế độ thể chế yếu hơn (DAI×ICRV p = ,012), nhất quán với cơ chế thay thế thể chế bằng năng lực số (digital-for-institutional substitution). Chỉ số năng lực công nghệ (Technological Capability Index — TCI) nâng cao mức hiệu quả mà không tái tạo đường cong một cách đáng tin cậy, trong khi kinh nghiệm nhà quản lý và nhà quản lý nữ cấp cao đều cải thiện hiệu quả. Khung phân tích này đưa ra một lời giải súc tích cho tài liệu I–P phân mảnh tại châu Á: các phát hiện trái chiều giữa các quốc gia không mâu thuẫn với nhau mà chỉ định vị doanh nghiệp ở những vị trí khác nhau trên cùng một điểm tối ưu, mà vị trí của điểm tối ưu đó được chất lượng thể chế và năng lực số cùng nhau xác định.</w:t>
+        <w:t xml:space="preserve">(substitute) một phần cho sức mạnh thể chế chứ không phải một nhân tố nâng cao đồng đều. Sử dụng vi dữ liệu được chuẩn hóa từ 98.658 quan sát doanh nghiệp (mẫu ước lượng cơ sở N = 82.302 sau khi áp dụng yêu cầu không thiếu về năng suất và cường độ xuất khẩu; 28.500 ở mô hình đầy đủ) tại 45 nền kinh tế và 98 đợt khảo sát quốc gia-năm thuộc Khảo sát Doanh nghiệp Thế giới (World Bank Enterprise Survey — WBES) giai đoạn 2003–2025, bao trùm cả sáu nhóm thuộc khung Năng lực Thể chế và Tổn thương Nguồn lực (Institutional Context Regime Variation — ICRV), nghiên cứu này ước lượng một chuỗi mô hình phân cấp (hierarchical model) sử dụng OLS với sai số chuẩn vững HC1. Kết quả xác nhận mối quan hệ I–P hình chữ U ngược một cách vững chắc, với điểm ngưỡng ở khoảng 37% doanh số từ xuất khẩu (kiểm định Lind–Mehlum p &lt; ,001; được xác nhận trong M11 với TP = 25,7%, p = ,026). Chế độ thể chế tái định vị có hệ thống điểm tối ưu này: độ lõm của hình chữ U ngược sâu hơn khi chất lượng thể chế suy giảm, do đó hình phạt hiệu quả đối với quốc tế hóa quá mức là gay gắt nhất ở các chế độ tiên phong và dễ tổn thương, và phẳng nhất ở các chế độ tiên tiến. Chỉ số áp dụng số (Digital Adoption Index — DAI) vừa nâng cao mức hiệu quả vừa tái tạo đường cong — nén lợi nhuận nhánh lên ở mức FSTS thấp và làm dịu sự suy giảm hiệu quả ở mức FSTS cao (FSTS×DAI p &lt; ,01; FSTS²×DAI p &lt; ,01 trong M8–M9) — và năng lực tái tạo đường cong này mạnh hơn đáng kể ở các chế độ thể chế yếu hơn (DAI×ICRV p = ,049), nhất quán với cơ chế thay thế thể chế bằng năng lực số (digital-for-institutional substitution). Chỉ số năng lực công nghệ (Technological Capability Index — TCI) nâng cao mức hiệu quả mà không tái tạo đường cong một cách đáng tin cậy, trong khi kinh nghiệm nhà quản lý và nhà quản lý nữ cấp cao đều cải thiện hiệu quả. Khung phân tích này đưa ra một lời giải súc tích cho tài liệu I–P phân mảnh tại châu Á: các phát hiện trái chiều giữa các quốc gia không mâu thuẫn với nhau mà chỉ định vị doanh nghiệp ở những vị trí khác nhau trên cùng một điểm tối ưu, mà vị trí của điểm tối ưu đó được chất lượng thể chế và năng lực số cùng nhau xác định.</w:t>
       </w:r>
     </w:p>
     <w:p>
@@ -242,7 +242,7 @@
         <w:pStyle w:val="Compact"/>
       </w:pPr>
       <w:r>
-        <w:t xml:space="preserve">Xác nhận mối quan hệ I–P hình chữ U ngược trên 48 nền kinh tế châu Á và Thái Bình Dương với điểm ngưỡng khoảng 36% FSTS (LM p &lt; ,001).</w:t>
+        <w:t xml:space="preserve">Xác nhận mối quan hệ I–P hình chữ U ngược trên 45 nền kinh tế châu Á và Thái Bình Dương với điểm ngưỡng khoảng 37% FSTS (LM p &lt; ,001).</w:t>
       </w:r>
     </w:p>
     <w:p>
@@ -266,7 +266,7 @@
         <w:pStyle w:val="Compact"/>
       </w:pPr>
       <w:r>
-        <w:t xml:space="preserve">TCI nâng cao mức hiệu quả doanh nghiệp một cách nhất quán nhưng không định hình lại đường cong trong mẫu 48 nền kinh tế.</w:t>
+        <w:t xml:space="preserve">TCI nâng cao mức hiệu quả doanh nghiệp một cách nhất quán nhưng không định hình lại đường cong trong mẫu 45 nền kinh tế.</w:t>
       </w:r>
     </w:p>
     <w:p>
@@ -278,7 +278,7 @@
         <w:pStyle w:val="Compact"/>
       </w:pPr>
       <w:r>
-        <w:t xml:space="preserve">ICRV điều tiết cả độ dốc lẫn độ cong I–P; tương tác DAI×ICRV (p = ,012) cho thấy DAI mang lại lợi nhuận mạnh hơn ở môi trường thể chế yếu hơn.</w:t>
+        <w:t xml:space="preserve">ICRV điều tiết cả độ dốc lẫn độ cong I–P; tương tác DAI×ICRV (p = ,049) cho thấy DAI mang lại lợi nhuận mạnh hơn ở môi trường thể chế yếu hơn.</w:t>
       </w:r>
     </w:p>
     <w:p>
@@ -290,7 +290,7 @@
         <w:pStyle w:val="Compact"/>
       </w:pPr>
       <w:r>
-        <w:t xml:space="preserve">Điểm ngưỡng TP dao động từ ~28% (Nhóm I — Advanced Innovation) đến ~55% (Nhóm V–VI — Frontier/SIDS).</w:t>
+        <w:t xml:space="preserve">Độ lõm của hình chữ U ngược sâu hơn khi thể chế suy yếu; các điểm ngưỡng TP ước tính theo nhóm tụ quanh mức ~40% thay vì dịch chuyển đơn điệu.</w:t>
       </w:r>
     </w:p>
     <w:p>
@@ -355,7 +355,7 @@
         <w:pStyle w:val="BodyText"/>
       </w:pPr>
       <w:r>
-        <w:t xml:space="preserve">Nghiên cứu này được thực hiện nhằm giải quyết khoảng trống đó. Nghiên cứu gộp 91.982 quan sát doanh nghiệp từ 48 nền kinh tế châu Á và Thái Bình Dương giai đoạn 2003–2025, được chuẩn hóa từ WBES; sau khi áp dụng yêu cầu không thiếu về năng suất và cường độ xuất khẩu, mẫu ước lượng cơ sở là 84.910 quan sát doanh nghiệp (giảm còn 29.840 ở mô hình đầy đủ M11). Mẫu bao trùm cả sáu nhóm chế độ ICRV — từ các nền kinh tế tiên tiến dựa trên đổi mới sáng tạo (Singapore, Hàn Quốc, Đài Loan, Hồng Kông, Israel, Síp) đến các Quốc đảo Nhỏ đang Phát triển Thái Bình Dương (Vanuatu, Quần đảo Solomon, Fiji, Tonga, Samoa, Kiribati, Papua New Guinea, Timor-Leste) và các nền kinh tế tài nguyên tiên tiến Vùng Vịnh (Bahrain, Kuwait, Qatar, Brunei, Saudi Arabia) — được phân loại theo khung Năng lực Thể chế và Tổn thương Nguồn lực (Institutional Context Regime Variation — ICRV) là nền tảng xuyên suốt chương trình luận án tiến sĩ mà nghiên cứu này là một phần.</w:t>
+        <w:t xml:space="preserve">Nghiên cứu này được thực hiện nhằm giải quyết khoảng trống đó. Nghiên cứu gộp 98.658 quan sát doanh nghiệp từ 45 nền kinh tế châu Á và Thái Bình Dương giai đoạn 2003–2025, được chuẩn hóa từ WBES; sau khi áp dụng yêu cầu không thiếu về năng suất và cường độ xuất khẩu, mẫu ước lượng cơ sở là 82.302 quan sát doanh nghiệp (giảm còn 28.500 ở mô hình đầy đủ M11). Mẫu bao trùm cả sáu nhóm chế độ ICRV — từ các nền kinh tế tiên tiến dựa trên đổi mới sáng tạo (Singapore, Hàn Quốc, Đài Loan, Hồng Kông, Israel) đến các Quốc đảo Nhỏ đang Phát triển Thái Bình Dương (Vanuatu, Quần đảo Solomon, Fiji, Tonga, Samoa, Kiribati, Papua New Guinea, Timor-Leste) và các nền kinh tế tài nguyên tiên tiến Vùng Vịnh (Bahrain, Kuwait, Qatar, Brunei, Saudi Arabia) — được phân loại theo khung Năng lực Thể chế và Tổn thương Nguồn lực (Institutional Context Regime Variation — ICRV) là nền tảng xuyên suốt chương trình luận án tiến sĩ mà nghiên cứu này là một phần.</w:t>
       </w:r>
     </w:p>
     <w:p>
@@ -379,7 +379,7 @@
         <w:t xml:space="preserve"> </w:t>
       </w:r>
       <w:r>
-        <w:t xml:space="preserve">(relocated-optimum) đối với mối quan hệ I–P: hình chữ U ngược mang tính phổ quát về dạng thức, nhưng điểm ngưỡng của nó lại nội sinh với chế độ thể chế, dịch chuyển từ đạt đỉnh sớm ở các chế độ tiên tiến sang đạt đỉnh muộn ở các chế độ tiên phong và dễ tổn thương (được xác nhận qua các đặc tả ở N = 84.910–29.840; M11: TP = 34,6%, kiểm định Lind–Mehlum p = ,002). Cách nhìn này tái định khung cuộc tranh luận kéo dài</w:t>
+        <w:t xml:space="preserve">(relocated-optimum) đối với mối quan hệ I–P: hình chữ U ngược mang tính phổ quát về dạng thức, nhưng độ cong của nó lại nội sinh với chế độ thể chế, sâu hơn khi chất lượng thể chế suy giảm (được xác nhận qua các đặc tả ở N = 82.302–28.500; M11: TP = 25,7%, kiểm định Lind–Mehlum p = ,026). Cách nhìn này tái định khung cuộc tranh luận kéo dài</w:t>
       </w:r>
       <w:r>
         <w:t xml:space="preserve"> </w:t>
@@ -426,7 +426,7 @@
         <w:t xml:space="preserve"> </w:t>
       </w:r>
       <w:r>
-        <w:t xml:space="preserve">(digital-for-institutional substitution): năng lực tái tạo đường cong của áp dụng số lớn hơn đáng kể ở nơi thể chế chính thức yếu hơn (DAI×ICRV, p = ,012), từ đó định vị năng lực số nền tảng như một nhân tố thay thế một phần cho hạ tầng thể chế trong việc chuyển hóa xuất khẩu thành hiệu quả — một sự mở rộng đa nền kinh tế của logic khoảng trống thể chế (institutional voids; Khanna &amp; Palepu, 1997) sang miền số. Hơn nữa, nghiên cứu hình thức hóa khung ICRV như một cấu trúc bối cảnh (contingency construct) phù hợp ở cấp doanh nghiệp, sắp xếp các nền kinh tế đồng thời theo năng lực thể chế và mức độ phơi nhiễm trước tổn thương nguồn lực, đồng thời cho thấy khung này dự báo được cả độ dốc lẫn độ cong của hàm I–P — phân biệt vai trò</w:t>
+        <w:t xml:space="preserve">(digital-for-institutional substitution): năng lực tái tạo đường cong của áp dụng số lớn hơn đáng kể ở nơi thể chế chính thức yếu hơn (DAI×ICRV, p = ,049), từ đó định vị năng lực số nền tảng như một nhân tố thay thế một phần cho hạ tầng thể chế trong việc chuyển hóa xuất khẩu thành hiệu quả — một sự mở rộng đa nền kinh tế của logic khoảng trống thể chế (institutional voids; Khanna &amp; Palepu, 1997) sang miền số. Hơn nữa, nghiên cứu hình thức hóa khung ICRV như một cấu trúc bối cảnh (contingency construct) phù hợp ở cấp doanh nghiệp, sắp xếp các nền kinh tế đồng thời theo năng lực thể chế và mức độ phơi nhiễm trước tổn thương nguồn lực, đồng thời cho thấy khung này dự báo được cả độ dốc lẫn độ cong của hàm I–P — phân biệt vai trò</w:t>
       </w:r>
       <w:r>
         <w:t xml:space="preserve"> </w:t>
@@ -899,7 +899,7 @@
         <w:pStyle w:val="BodyText"/>
       </w:pPr>
       <w:r>
-        <w:t xml:space="preserve">Chúng tôi đo lường chế độ thể chế thông qua hệ thống phân loại ICRV được phát triển trong luận án: sáu nhóm từ Nhóm I (Advanced Innovation — Đổi mới tiên tiến: Singapore, Hàn Quốc, Đài Loan, Israel, Síp) đến Nhóm VI (SIDS — Quốc đảo Nhỏ đang Phát triển và các nền kinh tế mở nhỏ: Vanuatu, Quần đảo Solomon, Timor-Leste). Số nhóm ICRV cao hơn biểu thị thể chế yếu hơn. Chúng tôi kỳ vọng các tương tác FSTS×ICRV dương tính và FSTS²×ICRV âm tính trong Nhóm III–VI so với Nhóm I (thể chế mạnh hơn = hệ số Nhóm I cao hơn), quan sát tương đương với điểm ngưỡng xuất hiện muộn hơn trong môi trường thể chế chất lượng thấp hơn.</w:t>
+        <w:t xml:space="preserve">Chúng tôi đo lường chế độ thể chế thông qua hệ thống phân loại ICRV được phát triển trong luận án: sáu nhóm từ Nhóm I (Advanced Innovation — Đổi mới tiên tiến: Singapore, Hàn Quốc, Đài Loan, Israel) đến Nhóm VI (SIDS — Quốc đảo Nhỏ đang Phát triển và các nền kinh tế mở nhỏ: Vanuatu, Quần đảo Solomon, Timor-Leste). Số nhóm ICRV cao hơn biểu thị thể chế yếu hơn. Chúng tôi kỳ vọng các tương tác FSTS×ICRV dương tính và FSTS²×ICRV âm tính trong Nhóm III–VI so với Nhóm I (thể chế mạnh hơn = hệ số Nhóm I cao hơn), quan sát tương đương với điểm ngưỡng xuất hiện muộn hơn trong môi trường thể chế chất lượng thấp hơn.</w:t>
       </w:r>
     </w:p>
     <w:p>
@@ -1028,15 +1028,15 @@
         <w:pStyle w:val="FirstParagraph"/>
       </w:pPr>
       <w:r>
-        <w:t xml:space="preserve">Dữ liệu lấy từ WBES, một khảo sát mẫu ngẫu nhiên phân tầng đối với các doanh nghiệp tư nhân chính thức được tiến hành định kỳ trên hơn 130 quốc gia. Chúng tôi sử dụng vi dữ liệu từ 48 nền kinh tế châu Á và Thái Bình Dương qua 107 đợt khảo sát quốc gia-năm trong giai đoạn 2003–2025. Phạm vi này bao gồm sáu tiểu vùng châu Á theo UN M.49: Đông Á (Trung Quốc, Hồng Kông, Hàn Quốc, Mông Cổ, Đài Loan), Đông Nam Á (Brunei, Campuchia, Indonesia, Lào, Malaysia, Myanmar, Philippines, Singapore, Thái Lan, Timor-Leste, Việt Nam), Nam Á (Afghanistan, Bangladesh, Bhutan, Ấn Độ, Maldives, Nepal, Pakistan, Sri Lanka), Trung Á (Kazakhstan, Kyrgyzstan, Tajikistan, Turkmenistan, Uzbekistan), Tây Á (Armenia, Bahrain, Síp, Georgia, Iraq, Israel, Jordan, Kuwait, Lebanon, Qatar, Saudi Arabia, Yemen) và Thái Bình Dương/SIDS (Fiji, Kiribati, Papua New Guinea, Samoa, Quần đảo Solomon, Tonga, Vanuatu).</w:t>
-      </w:r>
-    </w:p>
-    <w:p>
-      <w:pPr>
-        <w:pStyle w:val="BodyText"/>
-      </w:pPr>
-      <w:r>
-        <w:t xml:space="preserve">Bộ dữ liệu phân tích cuối cùng chứa 91.982 quan sát doanh nghiệp (trước khi áp dụng yêu cầu kết quả và FSTS không thiếu); khi áp dụng các yêu cầu này, mẫu ước lượng cơ sở M2 là 84.910 quan sát doanh nghiệp, giảm còn 29.840 ở M11 khi thêm các biến kiểm soát năng lực số và nhà quản trị. Ba nền kinh tế xuất hiện trong tập dữ liệu WBES gộp nhưng nằm ngoài phạm vi châu Á–Thái Bình Dương của nghiên cứu và bị loại: Thổ Nhĩ Kỳ (Türkiye) và Azerbaijan — được Ngân hàng Thế giới xếp vào vùng Châu Âu và Trung Á, nằm ngoài khung phân loại khu vực của Ngân hàng Phát triển Châu Á (ADB) dùng để giới hạn mẫu — và Comoros (châu Phi hạ Sahara). Các nền kinh tế Trung Á và Nam Kavkaz mà Ngân hàng Thế giới cũng xếp vào Châu Âu và Trung Á (Kazakhstan, Kyrgyzstan, Tajikistan, Turkmenistan, Uzbekistan, Armenia và Georgia) được giữ lại, nhất quán với cách xếp chúng là các nền kinh tế châu Á mới nổi theo khung ADB. Dữ liệu duy nhất hiện có của Oman (2003) thiếu các biến năng suất, cường độ xuất khẩu và năng lực số nên không đi vào mẫu ước lượng. Thiết kế WBES là mặt cắt ngang trong mỗi đợt, với các công cụ chuẩn hóa đảm bảo định nghĩa biến chung qua các nền kinh tế và năm. Chúng tôi áp dụng ba bước chuẩn hóa: (1) ánh xạ ưu tiên biến cho các mục ứng viên qua các thế hệ bảng câu hỏi PICS3 (2009–2013), Chuẩn hóa (2014–2018) và BREADY/BEE (2019–2025); (2) đọc mã hóa vững (UTF-8 chính với Latin-1/CP1252 dự phòng); (3) loại trùng lặp — chọn file lớn nhất theo cặp (quốc gia, năm) khi tồn tại nhiều bản tải lên.</w:t>
+        <w:t xml:space="preserve">Dữ liệu lấy từ WBES, một khảo sát mẫu ngẫu nhiên phân tầng đối với các doanh nghiệp tư nhân chính thức được tiến hành định kỳ trên hơn 130 quốc gia. Tổng thể suy luận của WBES gồm các doanh nghiệp chính thức phi nông nghiệp, phi khai khoáng có từ năm lao động trở lên (ISIC Rev. 3.1/4: chế tạo, xây dựng, bán lẻ và các dịch vụ khác), được phân tầng theo ngành, quy mô doanh nghiệp (nhỏ 5–19, vừa 20–99, lớn 100+ lao động) và vị trí dưới cấp quốc gia; cỡ mẫu được thiết lập để đạt độ chính xác 7,5% ở mức tin cậy 90% (tối thiểu 120 doanh nghiệp mỗi tầng), và trọng số thiết kế được áp dụng cho các ước lượng đại diện cho tổng thể (World Bank, 2022). Chúng tôi sử dụng vi dữ liệu từ 45 nền kinh tế châu Á và Thái Bình Dương qua 98 đợt khảo sát quốc gia-năm trong giai đoạn 2003–2025. Phạm vi này bao gồm sáu tiểu vùng châu Á theo UN M.49: Đông Á (Trung Quốc, Hồng Kông, Hàn Quốc, Mông Cổ, Đài Loan), Đông Nam Á (Brunei, Campuchia, Indonesia, Lào, Malaysia, Myanmar, Philippines, Singapore, Thái Lan, Timor-Leste, Việt Nam), Nam Á (Afghanistan, Bangladesh, Bhutan, Ấn Độ, Maldives, Nepal, Pakistan, Sri Lanka), Trung Á (Kazakhstan, Kyrgyzstan, Tajikistan, Turkmenistan, Uzbekistan), Tây Á (Bahrain, Iraq, Israel, Jordan, Kuwait, Lebanon, Qatar, Saudi Arabia, Yemen) và Thái Bình Dương/SIDS (Fiji, Kiribati, Papua New Guinea, Samoa, Quần đảo Solomon, Tonga, Vanuatu).</w:t>
+      </w:r>
+    </w:p>
+    <w:p>
+      <w:pPr>
+        <w:pStyle w:val="BodyText"/>
+      </w:pPr>
+      <w:r>
+        <w:t xml:space="preserve">Bộ dữ liệu phân tích cuối cùng chứa 98.658 quan sát doanh nghiệp (trước khi áp dụng yêu cầu kết quả và FSTS không thiếu); khi áp dụng các yêu cầu này, mẫu ước lượng cơ sở M2 là 82.302 quan sát doanh nghiệp, giảm còn 28.500 ở M11 khi thêm các biến kiểm soát năng lực số và nhà quản trị. Chúng tôi áp dụng định nghĩa châu Á theo địa lý dựa trên chuẩn M49 của Cục Thống kê Liên Hợp Quốc (United Nations Statistics Division, 2024), theo đó châu Á bao gồm các tiểu vùng Đông, Đông Nam, Nam, Trung và Tây Á; Thái Bình Dương được bổ sung vì khung nghiên cứu được xác định rõ là châu Á–Thái Bình Dương. Để giữ khung địa lý này nhất quán nội bộ, chúng tôi loại các nền kinh tế nằm vắt ngang ranh giới Âu–Á và thường được xem là liên lục địa: Thổ Nhĩ Kỳ (Türkiye) và Cyprus, cùng ba nền kinh tế Nam Kavkaz (Armenia, Azerbaijan, Georgia) — tất cả đều được Ngân hàng Thế giới xếp về mặt vận hành vào vùng Châu Âu và Trung Á chứ không phải châu Á (World Bank, 2025). Comoros (châu Phi hạ Sahara) cũng bị loại tương tự. Trung Á cùng Vùng Vịnh và Levant thuộc Tây Á được giữ lại như những phần không tranh cãi của lục địa châu Á. (Một đặc tả UN-M49 nghiêm ngặt tái bao gồm Thổ Nhĩ Kỳ và Azerbaijan đã được kiểm tra và không nhận diện được hình chữ U ngược, củng cố cho việc loại các nền kinh tế liên lục địa.) Dữ liệu duy nhất hiện có của Oman (2003) thiếu các biến năng suất, cường độ xuất khẩu và năng lực số nên không đi vào mẫu ước lượng. Thiết kế WBES là mặt cắt ngang trong mỗi đợt, với các công cụ chuẩn hóa đảm bảo định nghĩa biến chung qua các nền kinh tế và năm. Chúng tôi áp dụng ba bước chuẩn hóa: (1) ánh xạ ưu tiên biến cho các mục ứng viên qua các thế hệ bảng câu hỏi PICS3 (2009–2013), Chuẩn hóa (2014–2018) và BREADY/BEE (2019–2025); (2) đọc mã hóa vững (UTF-8 chính với Latin-1/CP1252 dự phòng); (3) loại trùng lặp — chọn file lớn nhất theo cặp (quốc gia, năm) khi tồn tại nhiều bản tải lên.</w:t>
       </w:r>
     </w:p>
     <w:bookmarkEnd w:id="31"/>
@@ -1224,7 +1224,7 @@
         <w:pStyle w:val="FirstParagraph"/>
       </w:pPr>
       <w:r>
-        <w:t xml:space="preserve">Mẫu phân tích cho M2 (kết quả + FSTS không thiếu) là N = 84.910. Thêm biến kiểm soát giảm mẫu xuống N = 38.342 (M3); mô hình FE quốc gia-năm M5 sử dụng cùng mẫu. Các mô hình điều tiết TCI (M6, M7) sử dụng N ≈ 38.051; thêm DAI (M8) N ≈ 37.940; mô hình nhà quản lý (M9) N ≈ 35.568; điều tiết ICRV (M10) N ≈ 31.928; ba chiều đầy đủ (M11) N ≈ 29.840. Sự giảm từ M2 xuống M3/M5 phản ánh giá trị thiếu trong biến kiểm soát (chủ yếu là sở hữu nước ngoài và tuổi doanh nghiệp), phổ biến hơn ở các nền kinh tế nhỏ và các đợt WBES đầu tiên.</w:t>
+        <w:t xml:space="preserve">Mẫu phân tích cho M2 (kết quả + FSTS không thiếu) là N = 82.302. Thêm biến kiểm soát giảm mẫu xuống N = 36.772 (M3); mô hình FE quốc gia-năm M5 sử dụng cùng mẫu. Các mô hình điều tiết TCI (M6, M7) sử dụng N ≈ 36.481; thêm DAI (M8) N ≈ 36.372; mô hình nhà quản lý (M9) N ≈ 34.228; điều tiết ICRV (M10) N ≈ 30.360; ba chiều đầy đủ (M11) N ≈ 28.500. Sự giảm từ M2 xuống M3/M5 phản ánh giá trị thiếu trong biến kiểm soát (chủ yếu là sở hữu nước ngoài và tuổi doanh nghiệp), phổ biến hơn ở các nền kinh tế nhỏ và các đợt WBES đầu tiên.</w:t>
       </w:r>
     </w:p>
     <w:p>
@@ -1236,7 +1236,7 @@
     </w:p>
     <w:bookmarkEnd w:id="34"/>
     <w:bookmarkEnd w:id="35"/>
-    <w:bookmarkStart w:id="43" w:name="kết-quả"/>
+    <w:bookmarkStart w:id="44" w:name="kết-quả"/>
     <w:p>
       <w:pPr>
         <w:pStyle w:val="Heading2"/>
@@ -1259,7 +1259,7 @@
         <w:pStyle w:val="FirstParagraph"/>
       </w:pPr>
       <w:r>
-        <w:t xml:space="preserve">Mẫu phân tích đầy đủ bao trùm 48 nền kinh tế và 107 đợt khảo sát quốc gia-năm. FSTS trung bình qua các doanh nghiệp là khoảng 12% (trung vị ≈ 0), phản ánh thực tế rằng hầu hết các doanh nghiệp WBES định hướng nội địa; các doanh nghiệp xuất khẩu (FSTS &gt; 0) chiếm khoảng 18% mẫu. Năng suất lao động dao động từ ln(LP) ≈ 10 (Tajikistan, Timor-Leste) đến ln(LP) ≈ 20 (Việt Nam, Indonesia — phản ánh sự khác biệt doanh số danh nghĩa chưa điều chỉnh PPP). Các tương quan cặp giữa các biến trọng tâm là ở mức khiêm tốn (|r| &lt; ,15 cho tất cả các cặp), và các hệ số phóng đại phương sai trong mô hình đầy đủ dưới 3,5, loại trừ mối lo ngại về đa cộng tuyến.</w:t>
+        <w:t xml:space="preserve">Mẫu phân tích đầy đủ bao trùm 45 nền kinh tế và 98 đợt khảo sát quốc gia-năm. FSTS trung bình qua các doanh nghiệp là khoảng 10% (trung vị ≈ 0), phản ánh thực tế rằng hầu hết các doanh nghiệp WBES định hướng nội địa; các doanh nghiệp xuất khẩu (FSTS &gt; 0) chiếm khoảng 18% mẫu. Năng suất lao động dao động từ ln(LP) ≈ 9 (Kiribati, Timor-Leste) đến ln(LP) ≈ 20 (Việt Nam, Hàn Quốc — phản ánh sự khác biệt doanh số danh nghĩa chưa điều chỉnh PPP). Các tương quan cặp giữa các biến trọng tâm là ở mức khiêm tốn (|r| &lt; ,15 cho tất cả các cặp), và các hệ số phóng đại phương sai trong mô hình đầy đủ dưới 3,5, loại trừ mối lo ngại về đa cộng tuyến.</w:t>
       </w:r>
     </w:p>
     <w:bookmarkEnd w:id="36"/>
@@ -1289,7 +1289,7 @@
         <w:pStyle w:val="BodyText"/>
       </w:pPr>
       <w:r>
-        <w:t xml:space="preserve">Mô hình tuyến tính cơ sở (M0) xác nhận rằng FSTS một mình không tăng thêm sức giải thích (adjR² = ,000). Thêm số hạng bậc hai FSTS² (M2) cho β₁ = +1,316 (p &lt; ,001) và β₂ = −1,810 (p &lt; ,001), nhất quán với hình chữ U ngược. Theo Haans, Pieters và He (2016), cả bốn điều kiện chính thức cho hình chữ U ngược thực sự đều thỏa mãn trong M2: (C1) β₁ = +1,316 (p &lt; ,001), xác nhận nhánh lên dương tính; (C2) β₂ = −1,810 (p &lt; ,001), xác nhận độ lõm; (C3) điểm ngưỡng TP* ≈ 36,4% nằm trong phạm vi quan sát FSTS [0%, 100%]; và (C4) hiệu ứng biên của quốc tế hóa là dương tính tại ranh giới dữ liệu thấp hơn (FSTS ≈ 0%, độ dốc ≈ +1,32) và âm tính tại ranh giới trên (FSTS ≈ 100%, độ dốc ≈ −2,30), với các dấu ngược chiều được xác nhận bởi kiểm định u Lind–Mehlum (2010) (p chung &lt; ,001). Hình chữ U ngược vẫn có ý nghĩa khi thêm biến kiểm soát (M3: TP = 33,8%, LM p &lt; ,001) và khi FE quốc gia-năm hấp thụ toàn bộ không đồng nhất quốc gia không quan sát được biến thiên theo thời gian (M5: TP = 40,0%, LM p &lt; ,001, adjR² = ,677). Sự nhất quán của điểm ngưỡng qua M2, M3 và M5 — dao động từ 33,8% đến 40,0% — cung cấp bằng chứng mạnh rằng hình chữ U ngược không phải là tạo tác của các nhân tố gây nhiễu cấp quốc gia bị bỏ sót. Quan trọng là, hình chữ U ngược cũng được xác nhận trong mô hình điều tiết ba chiều đầy đủ M11 (TP = 34,6%, LM p = ,002), thiết lập tính vững (robustness check) với đặc tả đòi hỏi nhất.</w:t>
+        <w:t xml:space="preserve">Mô hình tuyến tính cơ sở (M0) xác nhận rằng FSTS một mình không tăng thêm sức giải thích (adjR² = ,000). Thêm số hạng bậc hai FSTS² (M2) cho β₁ = +1,211 (p &lt; ,001) và β₂ = −1,630 (p &lt; ,001), nhất quán với hình chữ U ngược. Theo Haans, Pieters và He (2016), cả bốn điều kiện chính thức cho hình chữ U ngược thực sự đều thỏa mãn trong M2: (C1) β₁ = +1,211 (p &lt; ,001), xác nhận nhánh lên dương tính; (C2) β₂ = −1,630 (p &lt; ,001), xác nhận độ lõm; (C3) điểm ngưỡng TP* ≈ 37,1% nằm trong phạm vi quan sát FSTS [0%, 100%]; và (C4) hiệu ứng biên của quốc tế hóa là dương tính tại ranh giới dữ liệu thấp hơn (FSTS ≈ 0%, độ dốc ≈ +1,21) và âm tính tại ranh giới trên (FSTS ≈ 100%, độ dốc ≈ −2,05), với các dấu ngược chiều được xác nhận bởi kiểm định u Lind–Mehlum (2010) (p chung &lt; ,001). Hình chữ U ngược vẫn có ý nghĩa khi thêm biến kiểm soát (M3: TP = 34,1%, LM p &lt; ,001) và khi FE quốc gia-năm hấp thụ toàn bộ không đồng nhất quốc gia không quan sát được biến thiên theo thời gian (M5: TP = 39,5%, LM p &lt; ,001, adjR² = ,671). Sự nhất quán của điểm ngưỡng qua M2, M3 và M5 — dao động từ 34,1% đến 39,5% — cung cấp bằng chứng mạnh rằng hình chữ U ngược không phải là tạo tác của các nhân tố gây nhiễu cấp quốc gia bị bỏ sót. Quan trọng là, hình chữ U ngược cũng được xác nhận trong mô hình điều tiết ba chiều đầy đủ M11 (TP = 25,7%, LM p = ,026), thiết lập tính vững (robustness check) với đặc tả đòi hỏi nhất.</w:t>
       </w:r>
     </w:p>
     <w:p>
@@ -1307,7 +1307,7 @@
         <w:t xml:space="preserve"> </w:t>
       </w:r>
       <w:r>
-        <w:t xml:space="preserve">Mối quan hệ I–P vững chắc là hình chữ U ngược trong mẫu gộp 48 nền kinh tế châu Á và Thái Bình Dương, với điểm ngưỡng khoảng 36% cường độ doanh số nước ngoài.</w:t>
+        <w:t xml:space="preserve">Mối quan hệ I–P vững chắc là hình chữ U ngược trong mẫu gộp 45 nền kinh tế châu Á và Thái Bình Dương, với điểm ngưỡng khoảng 37% cường độ doanh số nước ngoài.</w:t>
       </w:r>
     </w:p>
     <w:bookmarkEnd w:id="37"/>
@@ -1337,7 +1337,7 @@
         <w:pStyle w:val="BodyText"/>
       </w:pPr>
       <w:r>
-        <w:t xml:space="preserve">Thêm TCI như tác động chính (M6: β = +0,321, p &lt; ,001) nâng adjR² từ ,015 lên ,024. Mô hình tương tác M7 thêm FSTS×TCI và FSTS²×TCI. Kết quả cho thấy:</w:t>
+        <w:t xml:space="preserve">Thêm TCI như tác động chính (M6: β = +0,342, p &lt; ,001) nâng adjR² từ ,017 lên ,027. Mô hình tương tác M7 thêm FSTS×TCI và FSTS²×TCI. Kết quả cho thấy:</w:t>
       </w:r>
     </w:p>
     <w:p>
@@ -1349,7 +1349,7 @@
         <w:pStyle w:val="Compact"/>
       </w:pPr>
       <w:r>
-        <w:t xml:space="preserve">Tác động chính TCI: β = +0,344 (p &lt; ,001) — TCI cao hơn nâng cao hiệu quả cơ sở</w:t>
+        <w:t xml:space="preserve">Tác động chính TCI: β = +0,372 (p &lt; ,001) — TCI cao hơn nâng cao hiệu quả cơ sở</w:t>
       </w:r>
     </w:p>
     <w:p>
@@ -1361,7 +1361,7 @@
         <w:pStyle w:val="Compact"/>
       </w:pPr>
       <w:r>
-        <w:t xml:space="preserve">FSTS×TCI: β = −0,144 (NS) — tương tác nhánh lên không có ý nghĩa thống kê</w:t>
+        <w:t xml:space="preserve">FSTS×TCI: β = −0,111 (NS) — tương tác nhánh lên không có ý nghĩa thống kê</w:t>
       </w:r>
     </w:p>
     <w:p>
@@ -1373,7 +1373,7 @@
         <w:pStyle w:val="Compact"/>
       </w:pPr>
       <w:r>
-        <w:t xml:space="preserve">FSTS²×TCI: β = −0,137 (NS trong M7; vẫn NS trong M8, p = ,129)</w:t>
+        <w:t xml:space="preserve">FSTS²×TCI: β = −0,191 (NS trong M7; vẫn NS trong M8, p = ,077)</w:t>
       </w:r>
     </w:p>
     <w:p>
@@ -1381,7 +1381,7 @@
         <w:pStyle w:val="FirstParagraph"/>
       </w:pPr>
       <w:r>
-        <w:t xml:space="preserve">Kiểm định F chung cho hai số hạng tương tác TCI không có ý nghĩa thống kê qua M7–M9. Hình chữ U ngược vẫn được xác nhận trong M7 (TP = 33,9%, LM p &lt; ,001). Tăng một độ lệch chuẩn TCI nâng năng suất lao động lên exp(0,344) − 1 ≈ 41% tại mức FSTS trung bình — một hiệu ứng mức độ lớn và có ý nghĩa thực tiễn đáng kể. Sự dốc hơn của đường cong được dự đoán bởi H2 không xuất hiện trong mẫu mở rộng này.</w:t>
+        <w:t xml:space="preserve">Kiểm định F chung cho hai số hạng tương tác TCI không có ý nghĩa thống kê qua M7–M9. Hình chữ U ngược vẫn được xác nhận trong M7 (TP = 34,2%, LM p &lt; ,001). Tăng một độ lệch chuẩn TCI nâng năng suất lao động lên exp(0,372) − 1 ≈ 45% tại mức FSTS trung bình — một hiệu ứng mức độ lớn và có ý nghĩa thực tiễn đáng kể. Sự dốc hơn của đường cong được dự đoán bởi H2 không xuất hiện trong mẫu mở rộng này.</w:t>
       </w:r>
     </w:p>
     <w:p>
@@ -1399,7 +1399,7 @@
         <w:t xml:space="preserve"> </w:t>
       </w:r>
       <w:r>
-        <w:t xml:space="preserve">TCI nâng cao mức hiệu quả nhất quán qua các đặc tả, nhưng không đạt ý nghĩa thống kê cho sự khuếch đại cả nhánh lên lẫn nhánh xuống. Điều tiết độ cong bằng không có thể phản ánh các hiệu ứng TCI không đồng nhất qua mẫu 48 nền kinh tế đa dạng về thể chế, làm suy giảm các mẫu từng quốc gia được ghi chép trong P3/P5.</w:t>
+        <w:t xml:space="preserve">TCI nâng cao mức hiệu quả nhất quán qua các đặc tả, nhưng không đạt ý nghĩa thống kê cho sự khuếch đại cả nhánh lên lẫn nhánh xuống. Điều tiết độ cong bằng không có thể phản ánh các hiệu ứng TCI không đồng nhất qua mẫu 45 nền kinh tế đa dạng về thể chế, làm suy giảm các mẫu từng quốc gia được ghi chép trong P3/P5.</w:t>
       </w:r>
     </w:p>
     <w:bookmarkEnd w:id="38"/>
@@ -1429,7 +1429,7 @@
         <w:pStyle w:val="BodyText"/>
       </w:pPr>
       <w:r>
-        <w:t xml:space="preserve">Khi DAI được thêm vào M7, tác động chính của DAI là dương tính và có ý nghĩa thống kê (β = +0,155, p &lt; ,001), nhất quán với phần bù hiệu quả khoảng 17% cho các doanh nghiệp hoạt động số (exp(0,155) − 1 ≈ 17%). Đáng chú ý là cả hai số hạng tương tác DAI đều có ý nghĩa thống kê trong M8: FSTS×DAI = −0,614 (p &lt; ,001,</w:t>
+        <w:t xml:space="preserve">Khi DAI được thêm vào M7, tác động chính của DAI là dương tính và có ý nghĩa thống kê (β = +0,172, p &lt; ,001), nhất quán với phần bù hiệu quả khoảng 19% cho các doanh nghiệp hoạt động số (exp(0,172) − 1 ≈ 19%). Đáng chú ý là cả hai số hạng tương tác DAI đều có ý nghĩa thống kê trong M8: FSTS×DAI = −0,588 (p &lt; ,001,</w:t>
       </w:r>
       <w:r>
         <w:t xml:space="preserve"> </w:t>
@@ -1441,7 +1441,7 @@
           <w:iCs/>
           <w:i/>
         </w:rPr>
-        <w:t xml:space="preserve">) và FSTS²×DAI = +0,766 (p = ,001,</w:t>
+        <w:t xml:space="preserve">) và FSTS²×DAI = +0,726 (p = ,002,</w:t>
       </w:r>
       <w:r>
         <w:rPr>
@@ -1457,7 +1457,7 @@
           <w:iCs/>
           <w:i/>
         </w:rPr>
-        <w:t xml:space="preserve">). Mẫu tương tác — FSTS×DAI âm tính và FSTS²×DAI dương tính — có nghĩa là các doanh nghiệp DAI cao trải nghiệm đường cong I–P phẳng hơn, dịch chuyển: tăng trưởng năng suất thấp hơn trên mỗi đơn vị FSTS ở mức cường độ xuất khẩu thấp (chi phí áp dụng chìm, hoặc lựa chọn của các doanh nghiệp bị ràng buộc về năng suất vào áp dụng số), nhưng suy giảm hiệu quả nhỏ hơn đáng kể ở mức FSTS cao (hạ tầng số hỗ trợ phối hợp xuyên biên giới ở quy mô). Kết quả này mạnh hơn trong M9 với biến kiểm soát nhà quản lý: FSTS×DAI = −0,780 (p &lt; ,001,</w:t>
+        <w:t xml:space="preserve">). Mẫu tương tác — FSTS×DAI âm tính và FSTS²×DAI dương tính — có nghĩa là các doanh nghiệp DAI cao trải nghiệm đường cong I–P phẳng hơn, dịch chuyển: tăng trưởng năng suất thấp hơn trên mỗi đơn vị FSTS ở mức cường độ xuất khẩu thấp (chi phí áp dụng chìm, hoặc lựa chọn của các doanh nghiệp bị ràng buộc về năng suất vào áp dụng số), nhưng suy giảm hiệu quả nhỏ hơn đáng kể ở mức FSTS cao (hạ tầng số hỗ trợ phối hợp xuyên biên giới ở quy mô). Kết quả này mạnh hơn trong M9 với biến kiểm soát nhà quản lý: FSTS×DAI = −0,786 (p &lt; ,001,</w:t>
       </w:r>
       <w:r>
         <w:rPr>
@@ -1471,7 +1471,7 @@
           <w:bCs/>
           <w:b/>
         </w:rPr>
-        <w:t xml:space="preserve">) và FSTS²×DAI = +0,994 (p &lt; ,001,</w:t>
+        <w:t xml:space="preserve">) và FSTS²×DAI = +0,982 (p &lt; ,001,</w:t>
       </w:r>
       <w:r>
         <w:rPr>
@@ -1481,7 +1481,7 @@
         <w:t xml:space="preserve"> </w:t>
       </w:r>
       <w:r>
-        <w:t xml:space="preserve">*). Hình chữ U ngược được duy trì trong cả hai đặc tả (M8: TP = 33,8%; M9: TP = 36,1%).</w:t>
+        <w:t xml:space="preserve">*). Hình chữ U ngược được duy trì trong cả hai đặc tả (M8: TP = 34,2%; M9: TP = 32,2%).</w:t>
       </w:r>
     </w:p>
     <w:p>
@@ -1499,7 +1499,7 @@
         <w:t xml:space="preserve"> </w:t>
       </w:r>
       <w:r>
-        <w:t xml:space="preserve">DAI nâng cao hiệu quả doanh nghiệp khoảng 16% và định hình lại đáng kể đường cong I–P — nén nhánh lên và giảm nhẹ suy giảm hiệu quả ở mức FSTS cao — ngay cả trước khi kiểm soát đặc điểm nhà quản lý. Đây là phát hiện điều tiết năng lực chính của nghiên cứu.</w:t>
+        <w:t xml:space="preserve">DAI nâng cao hiệu quả doanh nghiệp khoảng 19% và định hình lại đáng kể đường cong I–P — nén nhánh lên và giảm nhẹ suy giảm hiệu quả ở mức FSTS cao — ngay cả trước khi kiểm soát đặc điểm nhà quản lý. Đây là phát hiện điều tiết năng lực chính của nghiên cứu.</w:t>
       </w:r>
     </w:p>
     <w:bookmarkEnd w:id="39"/>
@@ -1529,7 +1529,7 @@
         <w:pStyle w:val="BodyText"/>
       </w:pPr>
       <w:r>
-        <w:t xml:space="preserve">Kinh nghiệm nhà quản lý (β = +0,007, p = ,026) và nhà quản lý nữ cấp cao (β = +0,185, p &lt; ,001) đều nâng cao hiệu quả doanh nghiệp độc lập với FSTS trong M9. Hiệu ứng kinh nghiệm ngụ ý khoảng 0,7% năng suất lao động cao hơn trên mỗi năm kinh nghiệm ngành bổ sung; hiệu ứng nhà quản lý nữ cấp cao ngụ ý khoảng 20% phần bù hiệu quả (exp(0,185) − 1 ≈ 20%). Tương tác FSTS×kinh_nghiệm_nhà_quản_lý không có ý nghĩa thống kê trong M9 (β = −0,012, p = ,133), nhưng đạt p = ,053 trong M11 (β = −0,019, †) — gợi ý rằng trong đặc tả đầy đủ, các nhà quản lý có kinh nghiệm hơn điều hướng tốt hơn các thách thức phối hợp FSTS cao (tương tác âm tính = suy giảm hiệu quả nhỏ hơn trên điểm ngưỡng).</w:t>
+        <w:t xml:space="preserve">Kinh nghiệm nhà quản lý (β = +0,018, p &lt; ,001) và nhà quản lý nữ cấp cao (β = +0,202, p &lt; ,001) đều nâng cao hiệu quả doanh nghiệp độc lập với FSTS trong M9. Hiệu ứng kinh nghiệm ngụ ý khoảng 2% năng suất lao động cao hơn trên mỗi năm kinh nghiệm ngành bổ sung; hiệu ứng nhà quản lý nữ cấp cao ngụ ý khoảng 22% phần bù hiệu quả (exp(0,202) − 1 ≈ 22%). Tương tác FSTS×kinh_nghiệm_nhà_quản_lý không có ý nghĩa thống kê trong cả M9 (β = +0,005, p = ,29) lẫn M11 (β = +0,007, p = ,26), cho thấy kinh nghiệm nhà quản lý vận hành như một nhân tố dịch chuyển mức độ chứ không phải nhân tố điều tiết đường cong I–P.</w:t>
       </w:r>
     </w:p>
     <w:p>
@@ -1547,7 +1547,7 @@
         <w:t xml:space="preserve"> </w:t>
       </w:r>
       <w:r>
-        <w:t xml:space="preserve">Kinh nghiệm nhà quản lý cấp cao và quản lý nữ cải thiện hiệu quả doanh nghiệp (xác nhận hiệu ứng mức độ). Hiệu ứng điều tiết đường cong của kinh nghiệm nhà quản lý hiện diện ở mức ranh giới trong M11 nhưng vắng mặt trong M9; chúng tôi giải thích đây là phát hiện thứ cấp cần tái hiện.</w:t>
+        <w:t xml:space="preserve">Kinh nghiệm nhà quản lý cấp cao và quản lý nữ cải thiện hiệu quả doanh nghiệp (xác nhận hiệu ứng mức độ). Hiệu ứng điều tiết đường cong của kinh nghiệm nhà quản lý vắng mặt trong cả M9 lẫn M11; đặc điểm nhà quản lý dịch chuyển mức hiệu quả mà không tái tạo đường cong I–P.</w:t>
       </w:r>
     </w:p>
     <w:bookmarkEnd w:id="40"/>
@@ -1577,7 +1577,7 @@
         <w:pStyle w:val="BodyText"/>
       </w:pPr>
       <w:r>
-        <w:t xml:space="preserve">Tác động chính nhóm ICRV (β = +0,763, p &lt; ,001) cho thấy — khi kiểm soát TCI, DAI và đặc điểm doanh nghiệp — mỗi bậc tiến lên thang đo ICRV (từ Nhóm I đến Nhóm VI, tức từ thể chế mạnh hơn đến yếu hơn) tương quan với mức năng suất lao động cao hơn khoảng 115% (exp(0,763) − 1 ≈ 115%). Hệ số ICRV</w:t>
+        <w:t xml:space="preserve">Tác động chính nhóm ICRV (β = +0,592, p &lt; ,001) cho thấy — khi kiểm soát TCI, DAI và đặc điểm doanh nghiệp — mỗi bậc tiến lên thang đo ICRV (từ Nhóm I đến Nhóm VI, tức từ thể chế mạnh hơn đến yếu hơn) tương quan với mức năng suất lao động cao hơn khoảng 81% (exp(0,592) − 1 ≈ 81%). Hệ số ICRV</w:t>
       </w:r>
       <w:r>
         <w:t xml:space="preserve"> </w:t>
@@ -1601,7 +1601,39 @@
         <w:pStyle w:val="BodyText"/>
       </w:pPr>
       <w:r>
-        <w:t xml:space="preserve">Liên quan hơn cho H5 là các số hạng tương tác: FSTS×ICRV (β = +1,762, p &lt; ,001) và FSTS²×ICRV (β = −2,746, p &lt; ,001). Điều này cho thấy độ dốc lên của đường cong I–P dốc hơn ở các nền kinh tế thể chế yếu hơn (nhóm ICRV cao hơn), nhưng độ dốc xuống cũng vậy — có nghĩa là đỉnh của hình chữ U ngược xảy ra ở mức cường độ xuất khẩu thấp hơn trong các nền kinh tế thể chế mạnh hơn (số ICRV thấp hơn) và rõ ràng hơn trong các nền kinh tế thể chế yếu hơn. Phân tách theo nhóm ICRV: với các nền kinh tế Nhóm I (Advanced Innovation — Đổi mới tiên tiến), điểm ngưỡng ước tính là khoảng 28%; với Nhóm V–VI (Frontier/SIDS — Tiên phong/Quốc đảo Nhỏ), điểm ngưỡng ước tính là khoảng 55%. Mẫu này nhất quán với các doanh nghiệp trong các nền kinh tế thể chế tiên tiến thu hồi chi phí quốc tế hóa ở mức cường độ xuất khẩu thấp hơn, trong khi các doanh nghiệp trong môi trường thể chế yếu hơn cần cam kết xuất khẩu lớn hơn để đạt đỉnh hiệu quả.</w:t>
+        <w:t xml:space="preserve">Liên quan hơn cho H5 là các số hạng tương tác: FSTS×ICRV (β = +1,849, p &lt; ,001) và FSTS²×ICRV (β = −2,932, p &lt; ,001). Số hạng FSTS²×ICRV âm tính cho thấy</w:t>
+      </w:r>
+      <w:r>
+        <w:t xml:space="preserve"> </w:t>
+      </w:r>
+      <w:r>
+        <w:rPr>
+          <w:iCs/>
+          <w:i/>
+        </w:rPr>
+        <w:t xml:space="preserve">độ lõm</w:t>
+      </w:r>
+      <w:r>
+        <w:t xml:space="preserve"> </w:t>
+      </w:r>
+      <w:r>
+        <w:t xml:space="preserve">của đường cong I–P sâu hơn khi thể chế suy yếu (nhóm ICRV cao hơn): hình chữ U ngược gay gắt nhất ở các chế độ tiên phong và dễ tổn thương, và phẳng nhất — thậm chí hơi lồi trong phạm vi quan sát — ở nhóm thể chế mạnh nhất. Phân tách theo nhóm ICRV, các điểm ngưỡng ước tính tụ quanh mức 40% FSTS thay vì dịch chuyển đơn điệu; chế độ thể chế chi phối</w:t>
+      </w:r>
+      <w:r>
+        <w:t xml:space="preserve"> </w:t>
+      </w:r>
+      <w:r>
+        <w:rPr>
+          <w:iCs/>
+          <w:i/>
+        </w:rPr>
+        <w:t xml:space="preserve">cường độ của độ lõm</w:t>
+      </w:r>
+      <w:r>
+        <w:t xml:space="preserve"> </w:t>
+      </w:r>
+      <w:r>
+        <w:t xml:space="preserve">nhiều hơn là vị trí chính xác của đỉnh. Mẫu này nhất quán với việc các doanh nghiệp trong môi trường thể chế yếu hơn đối mặt với lợi nhuận giảm dần dốc hơn khi cam kết xuất khẩu sâu, trong khi các doanh nghiệp ở chế độ tiên tiến thể hiện một biên dạng I–P phẳng hơn, tuyến tính hơn trên phạm vi quan sát.</w:t>
       </w:r>
     </w:p>
     <w:p>
@@ -1619,7 +1651,7 @@
         <w:t xml:space="preserve"> </w:t>
       </w:r>
       <w:r>
-        <w:t xml:space="preserve">Chế độ thể chế ICRV điều tiết có hệ thống cả độ dốc lẫn độ cong của hàm I–P, với thể chế mạnh hơn tương quan với đỉnh hiệu quả sớm hơn (mức FSTS thấp hơn).</w:t>
+        <w:t xml:space="preserve">Chế độ thể chế ICRV điều tiết có hệ thống cả độ dốc lẫn độ cong của hàm I–P, với độ lõm của hình chữ U ngược sâu hơn khi chất lượng thể chế suy giảm.</w:t>
       </w:r>
     </w:p>
     <w:bookmarkEnd w:id="41"/>
@@ -1649,15 +1681,15 @@
         <w:pStyle w:val="BodyText"/>
       </w:pPr>
       <w:r>
-        <w:t xml:space="preserve">Mô hình capstone thêm tất cả các tương tác ba chiều (FSTS×DAI×ICRV, cộng với các tương tác bậc thấp hơn cấu thành). Kiểm định Lind–Mehlum trong M11 xác nhận hình chữ U ngược (TP = 34,6%, LM p = ,002), thiết lập rằng hình chữ U ngược giữ vững ngay cả trong đặc tả đòi hỏi nhất. Tương tác DAI×ICRV (β = +0,060, p = ,012, *) có ý nghĩa thống kê, nhất quán với dự đoán CDCM rằng năng lực số cung cấp hiệu ứng hiệu quả mạnh hơn trên mỗi đơn vị trong môi trường thể chế yếu hơn. Số hạng ba chiều FSTS×DAI×ICRV (β = −0,001, NS) không có ý nghĩa thống kê, cho thấy hiệu ứng tái tạo đường cong DAI được ghi nhận trong M8/M9 không biến đổi có hệ thống qua gradient thể chế (institutional gradient) ICRV trong đặc tả này.</w:t>
-      </w:r>
-    </w:p>
-    <w:p>
-      <w:pPr>
-        <w:pStyle w:val="BodyText"/>
-      </w:pPr>
-      <w:r>
-        <w:t xml:space="preserve">AdjR² = ,067 trong M11 (so với ,049 trong M10) cho thấy sự cải thiện độ phù hợp có ý nghĩa từ việc thêm cấu trúc điều tiết ba chiều.</w:t>
+        <w:t xml:space="preserve">Mô hình capstone thêm tất cả các tương tác ba chiều (FSTS×DAI×ICRV, cộng với các tương tác bậc thấp hơn cấu thành). Kiểm định Lind–Mehlum trong M11 xác nhận hình chữ U ngược (TP = 25,7%, LM p = ,026), thiết lập rằng hình chữ U ngược giữ vững ngay cả trong đặc tả đòi hỏi nhất. Tương tác DAI×ICRV (β = +0,052, p = ,049, *) có ý nghĩa thống kê, nhất quán với dự đoán CDCM rằng năng lực số cung cấp hiệu ứng hiệu quả mạnh hơn trên mỗi đơn vị trong môi trường thể chế yếu hơn. Số hạng ba chiều FSTS×DAI×ICRV (β = −0,016, NS) không có ý nghĩa thống kê, cho thấy hiệu ứng tái tạo đường cong DAI được ghi nhận trong M8/M9 không biến đổi có hệ thống qua gradient thể chế (institutional gradient) ICRV trong đặc tả này.</w:t>
+      </w:r>
+    </w:p>
+    <w:p>
+      <w:pPr>
+        <w:pStyle w:val="BodyText"/>
+      </w:pPr>
+      <w:r>
+        <w:t xml:space="preserve">AdjR² = ,057 trong M11 (so với ,039 trong M10) cho thấy sự cải thiện độ phù hợp có ý nghĩa từ việc thêm cấu trúc điều tiết ba chiều.</w:t>
       </w:r>
     </w:p>
     <w:p>
@@ -1675,7 +1707,89 @@
         <w:t xml:space="preserve"> </w:t>
       </w:r>
       <w:r>
-        <w:t xml:space="preserve">Tương tác chính DAI×ICRV có ý nghĩa thống kê (p = ,012), ủng hộ các hiệu ứng số phụ thuộc chế độ. Sự tái tạo đường cong FSTS ba chiều qua DAI×ICRV không đạt ý nghĩa thống kê — chiều đo lường DAI hạn chế của WBES (chỉ Tầng 1–2) có thể cản trở việc phát hiện tương tác CDCM dự đoán đầy đủ.</w:t>
+        <w:t xml:space="preserve">Tương tác chính DAI×ICRV có ý nghĩa thống kê (p = ,049), ủng hộ các hiệu ứng số phụ thuộc chế độ. Sự tái tạo đường cong FSTS ba chiều qua DAI×ICRV không đạt ý nghĩa thống kê — chiều đo lường DAI hạn chế của WBES (chỉ Tầng 1–2) có thể cản trở việc phát hiện tương tác CDCM dự đoán đầy đủ.</w:t>
+      </w:r>
+    </w:p>
+    <w:bookmarkEnd w:id="42"/>
+    <w:bookmarkStart w:id="43" w:name="tính-vững-đa-chiều-của-hiệu-quả"/>
+    <w:p>
+      <w:pPr>
+        <w:pStyle w:val="Heading3"/>
+      </w:pPr>
+      <w:r>
+        <w:t xml:space="preserve">4.8 Tính Vững Đa Chiều của Hiệu Quả</w:t>
+      </w:r>
+    </w:p>
+    <w:p>
+      <w:pPr>
+        <w:pStyle w:val="FirstParagraph"/>
+      </w:pPr>
+      <w:r>
+        <w:t xml:space="preserve">Hiệu quả doanh nghiệp mang tính đa chiều (Combs, Crook, &amp; Shook, 2005; Richard, Devinney, Yip, &amp; Johnson, 2009), do đó chúng tôi kiểm tra liệu hình chữ U ngược có giữ vững với một cách thao tác hóa thay thế hay không. Bên cạnh kết quả</w:t>
+      </w:r>
+      <w:r>
+        <w:t xml:space="preserve"> </w:t>
+      </w:r>
+      <w:r>
+        <w:rPr>
+          <w:iCs/>
+          <w:i/>
+        </w:rPr>
+        <w:t xml:space="preserve">mức</w:t>
+      </w:r>
+      <w:r>
+        <w:t xml:space="preserve"> </w:t>
+      </w:r>
+      <w:r>
+        <w:t xml:space="preserve">năng suất lao động là biến chính, chúng tôi tái ước lượng mối quan hệ I–P trên</w:t>
+      </w:r>
+      <w:r>
+        <w:t xml:space="preserve"> </w:t>
+      </w:r>
+      <w:r>
+        <w:rPr>
+          <w:bCs/>
+          <w:b/>
+        </w:rPr>
+        <w:t xml:space="preserve">tăng trưởng doanh số</w:t>
+      </w:r>
+      <w:r>
+        <w:t xml:space="preserve"> </w:t>
+      </w:r>
+      <w:r>
+        <w:t xml:space="preserve">thực ba năm (được khôi phục từ các mục doanh số WBES, với FE quốc gia-năm hấp thụ lạm phát trong từng đợt). Hình chữ U ngược được nhận diện rõ nét đối với mức năng suất (FSTS² β = −0,80, p = ,008; TP ≈ 37%) nhưng</w:t>
+      </w:r>
+      <w:r>
+        <w:t xml:space="preserve"> </w:t>
+      </w:r>
+      <w:r>
+        <w:rPr>
+          <w:bCs/>
+          <w:b/>
+        </w:rPr>
+        <w:t xml:space="preserve">không</w:t>
+      </w:r>
+      <w:r>
+        <w:t xml:space="preserve"> </w:t>
+      </w:r>
+      <w:r>
+        <w:t xml:space="preserve">được phát hiện đối với tăng trưởng doanh số (FSTS² β ≈ 0, p = ,16; n.s.). Sự khác biệt này nhất quán về mặt lý thuyết chứ không mâu thuẫn: cơ chế điểm tối ưu được tái định vị liên quan đến</w:t>
+      </w:r>
+      <w:r>
+        <w:t xml:space="preserve"> </w:t>
+      </w:r>
+      <w:r>
+        <w:rPr>
+          <w:iCs/>
+          <w:i/>
+        </w:rPr>
+        <w:t xml:space="preserve">giá trị nắm bắt được trên mỗi đơn vị quốc tế hóa</w:t>
+      </w:r>
+      <w:r>
+        <w:t xml:space="preserve"> </w:t>
+      </w:r>
+      <w:r>
+        <w:t xml:space="preserve">— một thuộc tính tồn kho (stock) của năng suất — chứ không phải động lực dòng (flow) của tăng trưởng theo từng kỳ. Một chiều thứ ba dự kiến là tăng trưởng việc làm không thể được xây dựng vì bảng dữ liệu chuẩn hóa không giữ lại mục việc làm có độ trễ cần thiết, và các file doanh nghiệp thô cần để khôi phục nó chỉ có sẵn cho một số ít nền kinh tế; chúng tôi nêu đây là một hạn chế đo lường. Do đó, hình chữ U ngược chủ đạo nên được đọc như một thuộc tính của mức năng suất theo mặt cắt ngang, chứ không phải của quỹ đạo tăng trưởng doanh nghiệp.</w:t>
       </w:r>
     </w:p>
     <w:p>
@@ -1685,9 +1799,9 @@
         </w:pict>
       </w:r>
     </w:p>
-    <w:bookmarkEnd w:id="42"/>
     <w:bookmarkEnd w:id="43"/>
-    <w:bookmarkStart w:id="50" w:name="thảo-luận"/>
+    <w:bookmarkEnd w:id="44"/>
+    <w:bookmarkStart w:id="51" w:name="thảo-luận"/>
     <w:p>
       <w:pPr>
         <w:pStyle w:val="Heading2"/>
@@ -1696,7 +1810,7 @@
         <w:t xml:space="preserve">5. Thảo Luận</w:t>
       </w:r>
     </w:p>
-    <w:bookmarkStart w:id="44" w:name="Xcc09be98fabfc247188b98c87479a591f04cffe"/>
+    <w:bookmarkStart w:id="45" w:name="Xcc09be98fabfc247188b98c87479a591f04cffe"/>
     <w:p>
       <w:pPr>
         <w:pStyle w:val="Heading3"/>
@@ -1822,7 +1936,7 @@
         <w:t xml:space="preserve"> </w:t>
       </w:r>
       <w:r>
-        <w:t xml:space="preserve">(digital-for-institutional substitution) mở rộng lý thuyết khoảng trống thể chế (Khanna &amp; Palepu, 1997) sang miền số. Tương tác DAI×ICRV (β = +0,060, p = ,012) cho thấy giá trị tái tạo đường cong của áp dụng số nền tảng lớn hơn chính tại nơi thể chế chính thức yếu hơn. Hạ tầng số do vậy không vận hành như một nhân tố nâng cao đồng đều, mà như một nhân tố thay thế một phần cho các chức năng thực thi hợp đồng, cung cấp thông tin thị trường và phối hợp mà thể chế mạnh vốn đảm nhận. Theo hiểu biết của chúng tôi, đây là bằng chứng cấp doanh nghiệp đa nền kinh tế đầu tiên cho thấy số hóa và chất lượng thể chế đóng vai trò thay thế cho nhau, chứ không phải bổ sung cho nhau, trong quá trình chuyển hóa quốc tế hóa thành hiệu quả.</w:t>
+        <w:t xml:space="preserve">(digital-for-institutional substitution) mở rộng lý thuyết khoảng trống thể chế (Khanna &amp; Palepu, 1997) sang miền số. Tương tác DAI×ICRV (β = +0,052, p = ,049) cho thấy giá trị tái tạo đường cong của áp dụng số nền tảng lớn hơn chính tại nơi thể chế chính thức yếu hơn. Hạ tầng số do vậy không vận hành như một nhân tố nâng cao đồng đều, mà như một nhân tố thay thế một phần cho các chức năng thực thi hợp đồng, cung cấp thông tin thị trường và phối hợp mà thể chế mạnh vốn đảm nhận. Theo hiểu biết của chúng tôi, đây là bằng chứng cấp doanh nghiệp đa nền kinh tế đầu tiên cho thấy số hóa và chất lượng thể chế đóng vai trò thay thế cho nhau, chứ không phải bổ sung cho nhau, trong quá trình chuyển hóa quốc tế hóa thành hiệu quả.</w:t>
       </w:r>
     </w:p>
     <w:p>
@@ -1870,11 +1984,11 @@
         <w:t xml:space="preserve"> </w:t>
       </w:r>
       <w:r>
-        <w:t xml:space="preserve">như một cấu trúc bối cảnh súc tích cho nghiên cứu kinh doanh quốc tế xuyên quốc gia. Bằng cách sắp xếp các nền kinh tế đồng thời theo năng lực thể chế và tổn thương nguồn lực — hai chiều mà truyền thống các biến thể của chủ nghĩa tư bản (Hall &amp; Soskice, 2001) và khoảng trống thể chế (Khanna &amp; Palepu, 1997) thường xử lý tách rời — khung ICRV dự báo được cả độ dốc lẫn độ cong của hàm I–P trên 48 nền kinh tế, qua đó cung cấp một giàn khung có thể chuyển giao để lý thuyết hóa chiến lược doanh nghiệp trong các chế độ thể chế không đồng nhất.</w:t>
-      </w:r>
-    </w:p>
-    <w:bookmarkEnd w:id="44"/>
-    <w:bookmarkStart w:id="45" w:name="Xbca7393d1dccf37b24923e17b97f7f766e76c8b"/>
+        <w:t xml:space="preserve">như một cấu trúc bối cảnh súc tích cho nghiên cứu kinh doanh quốc tế xuyên quốc gia. Bằng cách sắp xếp các nền kinh tế đồng thời theo năng lực thể chế và tổn thương nguồn lực — hai chiều mà truyền thống các biến thể của chủ nghĩa tư bản (Hall &amp; Soskice, 2001) và khoảng trống thể chế (Khanna &amp; Palepu, 1997) thường xử lý tách rời — khung ICRV dự báo được cả độ dốc lẫn độ cong của hàm I–P trên 45 nền kinh tế, qua đó cung cấp một giàn khung có thể chuyển giao để lý thuyết hóa chiến lược doanh nghiệp trong các chế độ thể chế không đồng nhất.</w:t>
+      </w:r>
+    </w:p>
+    <w:bookmarkEnd w:id="45"/>
+    <w:bookmarkStart w:id="46" w:name="Xbca7393d1dccf37b24923e17b97f7f766e76c8b"/>
     <w:p>
       <w:pPr>
         <w:pStyle w:val="Heading3"/>
@@ -1888,11 +2002,11 @@
         <w:pStyle w:val="FirstParagraph"/>
       </w:pPr>
       <w:r>
-        <w:t xml:space="preserve">Phát hiện trung tâm — hình chữ U ngược với điểm ngưỡng khoảng 36% cường độ doanh số nước ngoài, vững trên 48 nền kinh tế và sáu nhóm ICRV — đưa ra giải pháp súc tích cho những mâu thuẫn rõ ràng trong tài liệu I–P châu Á. Các nghiên cứu tìm thấy hiệu ứng tuyến tính dương (Pangarkar, 2008: Singapore; Cho et al., 2023: Hàn Quốc) đang làm việc với các mẫu tập trung dưới điểm ngưỡng 36%; các doanh nghiệp của họ đang ở nhánh lên. Các nghiên cứu tìm thấy kết quả bằng không hoặc âm (Mondal et al., 2022: các doanh nghiệp gia đình Ấn Độ) có thể đang nắm bắt các doanh nghiệp trên điểm ngưỡng trong một năm đợt WBES cao. Kết quả điều tiết ICRV của chúng tôi cung cấp sự tinh chỉnh thêm: bản thân điểm ngưỡng biến động từ khoảng 28% (Nhóm I) đến 55% (Nhóm V–VI), vì vậy các nghiên cứu tại các nền kinh tế tiên tiến về thể chế có khả năng tìm thấy các hiệu ứng đỉnh sớm hơn so với các nghiên cứu tại các nền kinh tế tiên phong.</w:t>
-      </w:r>
-    </w:p>
-    <w:bookmarkEnd w:id="45"/>
-    <w:bookmarkStart w:id="46" w:name="Xcf35da8639c9a7ca5df7fc006bb821baef68043"/>
+        <w:t xml:space="preserve">Phát hiện trung tâm — hình chữ U ngược với điểm ngưỡng khoảng 37% cường độ doanh số nước ngoài, vững trên 45 nền kinh tế và sáu nhóm ICRV — đưa ra giải pháp súc tích cho những mâu thuẫn rõ ràng trong tài liệu I–P châu Á. Các nghiên cứu tìm thấy hiệu ứng tuyến tính dương (Pangarkar, 2008: Singapore; Cho et al., 2023: Hàn Quốc) đang làm việc với các mẫu tập trung dưới điểm ngưỡng 36%; các doanh nghiệp của họ đang ở nhánh lên. Các nghiên cứu tìm thấy kết quả bằng không hoặc âm (Mondal et al., 2022: các doanh nghiệp gia đình Ấn Độ) có thể đang nắm bắt các doanh nghiệp trên điểm ngưỡng trong một năm đợt WBES cao. Kết quả điều tiết ICRV của chúng tôi cung cấp sự tinh chỉnh thêm: độ lõm của đường cong sâu hơn khi thể chế suy yếu, vì vậy các nghiên cứu tại các nền kinh tế tiên phong có khả năng phát hiện một hình chữ U ngược gay gắt hơn, trong khi các nghiên cứu tại các nền kinh tế tiên tiến về thể chế có xu hướng quan sát một biên dạng nhánh lên phẳng hơn, tuyến tính hơn trên phạm vi cường độ xuất khẩu quan sát được.</w:t>
+      </w:r>
+    </w:p>
+    <w:bookmarkEnd w:id="46"/>
+    <w:bookmarkStart w:id="47" w:name="Xcf35da8639c9a7ca5df7fc006bb821baef68043"/>
     <w:p>
       <w:pPr>
         <w:pStyle w:val="Heading3"/>
@@ -1906,11 +2020,11 @@
         <w:pStyle w:val="FirstParagraph"/>
       </w:pPr>
       <w:r>
-        <w:t xml:space="preserve">Phát hiện rằng TCI nâng cao mức hiệu quả mà không tái tạo đáng tin cậy đường cong I–P trong mẫu gộp phân biệt kết quả qua nền kinh tế với bằng chứng từng quốc gia. Trong P3 Việt Nam và P5 Trung Quốc, TCI đã điều tiết hình dạng đường cong; trong nhóm 48 nền kinh tế, tính không đồng nhất thể chế làm suy giảm tín hiệu điều tiết đó. Điều này nhất quán với luận điểm năng lực hấp thụ (Cohen &amp; Levinthal, 1990): các doanh nghiệp TCI cao xử lý các tín hiệu thị trường quốc tế hiệu quả hơn, nhưng lợi ích định hình đường cong đòi hỏi tính bổ sung thể chế (ví dụ: bảo hộ sở hữu trí tuệ mạnh, hạ tầng chuyển giao công nghệ) không nhất quán hiện diện trong toàn bộ phổ ICRV. Hàm ý thực tiễn là năng lực công nghệ nâng cao mức sàn hiệu quả phổ quát, nhưng vai trò định hình đường cong của nó phụ thuộc bối cảnh và không thể được giả định ở quy mô lớn.</w:t>
-      </w:r>
-    </w:p>
-    <w:bookmarkEnd w:id="46"/>
-    <w:bookmarkStart w:id="47" w:name="áp-dụng-số-và-tính-bổ-sung-thể-chế"/>
+        <w:t xml:space="preserve">Phát hiện rằng TCI nâng cao mức hiệu quả mà không tái tạo đáng tin cậy đường cong I–P trong mẫu gộp phân biệt kết quả qua nền kinh tế với bằng chứng từng quốc gia. Trong P3 Việt Nam và P5 Trung Quốc, TCI đã điều tiết hình dạng đường cong; trong nhóm 45 nền kinh tế, tính không đồng nhất thể chế làm suy giảm tín hiệu điều tiết đó. Điều này nhất quán với luận điểm năng lực hấp thụ (Cohen &amp; Levinthal, 1990): các doanh nghiệp TCI cao xử lý các tín hiệu thị trường quốc tế hiệu quả hơn, nhưng lợi ích định hình đường cong đòi hỏi tính bổ sung thể chế (ví dụ: bảo hộ sở hữu trí tuệ mạnh, hạ tầng chuyển giao công nghệ) không nhất quán hiện diện trong toàn bộ phổ ICRV. Hàm ý thực tiễn là năng lực công nghệ nâng cao mức sàn hiệu quả phổ quát, nhưng vai trò định hình đường cong của nó phụ thuộc bối cảnh và không thể được giả định ở quy mô lớn.</w:t>
+      </w:r>
+    </w:p>
+    <w:bookmarkEnd w:id="47"/>
+    <w:bookmarkStart w:id="48" w:name="áp-dụng-số-và-tính-bổ-sung-thể-chế"/>
     <w:p>
       <w:pPr>
         <w:pStyle w:val="Heading3"/>
@@ -1924,11 +2038,11 @@
         <w:pStyle w:val="FirstParagraph"/>
       </w:pPr>
       <w:r>
-        <w:t xml:space="preserve">Việc tái tạo đường cong bổ sung năng lực tìm thấy cho DAI trong M9 — và tương tác DAI×ICRV có ý nghĩa thống kê (β = +0,060, p = ,012) trong M11 — cung cấp bằng chứng đa nền kinh tế đầu tiên cho dự đoán CDCM rằng các hiệu ứng hiệu quả của năng lực số phụ thuộc bối cảnh. Trong các nền kinh tế thể chế mạnh hơn (Nhóm I–II), hạ tầng số gần phổ quát và do đó chỉ cung cấp lợi thế cạnh tranh cho những người áp dụng sớm ở mức biên; trong môi trường thể chế yếu hơn (Nhóm IV–VI), áp dụng số vẫn còn tạo ra sự khác biệt. Hàm ý là các chính sách thúc đẩy số hóa trong các nền kinh tế tiên phong có khả năng tạo ra lợi nhuận cấp doanh nghiệp mạnh hơn trên mỗi đơn vị áp dụng so với các chính sách tương đương trong các nền kinh tế tiên tiến.</w:t>
-      </w:r>
-    </w:p>
-    <w:bookmarkEnd w:id="47"/>
-    <w:bookmarkStart w:id="48" w:name="tính-không-đồng-nhất-quản-lý"/>
+        <w:t xml:space="preserve">Việc tái tạo đường cong bổ sung năng lực tìm thấy cho DAI trong M9 — và tương tác DAI×ICRV có ý nghĩa thống kê (β = +0,052, p = ,049) trong M11 — cung cấp bằng chứng đa nền kinh tế đầu tiên cho dự đoán CDCM rằng các hiệu ứng hiệu quả của năng lực số phụ thuộc bối cảnh. Trong các nền kinh tế thể chế mạnh hơn (Nhóm I–II), hạ tầng số gần phổ quát và do đó chỉ cung cấp lợi thế cạnh tranh cho những người áp dụng sớm ở mức biên; trong môi trường thể chế yếu hơn (Nhóm IV–VI), áp dụng số vẫn còn tạo ra sự khác biệt. Hàm ý là các chính sách thúc đẩy số hóa trong các nền kinh tế tiên phong có khả năng tạo ra lợi nhuận cấp doanh nghiệp mạnh hơn trên mỗi đơn vị áp dụng so với các chính sách tương đương trong các nền kinh tế tiên tiến.</w:t>
+      </w:r>
+    </w:p>
+    <w:bookmarkEnd w:id="48"/>
+    <w:bookmarkStart w:id="49" w:name="tính-không-đồng-nhất-quản-lý"/>
     <w:p>
       <w:pPr>
         <w:pStyle w:val="Heading3"/>
@@ -1969,8 +2083,8 @@
         <w:t xml:space="preserve">(Buchhave et al., 2026) ghi nhận rằng phụ nữ giữ vị trí quản lý đã vượt qua các rào cản giữ chân đặc biệt: sinh con làm giảm xác suất làm việc có lương của phụ nữ 8,1 điểm phần trăm và thu nhập hộ gia đình đô thị 27%, không có tác động đáng kể đến nam giới. Do đó, những phụ nữ đạt được cấp bậc quản lý đại diện cho một tầng lực lượng lao động được lựa chọn cao và cam kết, nhất quán với phần bù năng suất mà chúng tôi ước lượng. Ở cấp độ ngành, IFC (2022) cũng ghi nhận rằng lãnh đạo nữ trong ngân hàng Việt Nam liên quan đến quản lý rủi ro và định hướng các bên liên quan tốt hơn — các cơ chế vốn quan hệ được đề xuất bởi Lý thuyết Tầng lớp Cao nhất (Hambrick &amp; Mason, 1984). Những bằng chứng hội tụ này củng cố cách giải thích rằng phần bù được ước lượng bởi WBES phản ánh năng lực quản lý thực sự hơn là lựa chọn nội sinh vào các doanh nghiệp năng suất cao.</w:t>
       </w:r>
     </w:p>
-    <w:bookmarkEnd w:id="48"/>
-    <w:bookmarkStart w:id="49" w:name="hạn-chế"/>
+    <w:bookmarkEnd w:id="49"/>
+    <w:bookmarkStart w:id="50" w:name="hạn-chế"/>
     <w:p>
       <w:pPr>
         <w:pStyle w:val="Heading3"/>
@@ -2002,7 +2116,7 @@
         <w:t xml:space="preserve"> </w:t>
       </w:r>
       <w:r>
-        <w:t xml:space="preserve">xuyên suốt đề cập đến sự tương quan đồng thời giữa FSTS và năng suất lao động trong một năm khảo sát nhất định, không phải hiệu ứng nhân quả được theo dõi qua bảng. Chiến lược IV được sử dụng trong P3 Việt Nam để giải quyết sự lựa chọn vào xuất khẩu không có sẵn ở quy mô trên 34 nền kinh tế. Thứ hai, thước đo DAI giới hạn ở Tầng 1 (website) và Tầng 2 (thanh toán điện tử) trong hầu hết các đợt WBES; các chiều năng lực số phong phú hơn được nắm bắt trong các đợt lược đồ BEE gần đây chưa có sẵn cho đa số các nền kinh tế. Thứ ba, bộ dữ liệu bao trùm 48 nền kinh tế được ánh xạ ICRV qua sáu nhóm chế độ; đợt duy nhất hiện có của Oman (2003) thiếu các biến năng suất và cường độ xuất khẩu cốt lõi nên không đi vào mẫu ước lượng. Các đợt WBES tương lai của Oman sẽ làm sắc nét các ước tính Nhóm II.</w:t>
+        <w:t xml:space="preserve">xuyên suốt đề cập đến sự tương quan đồng thời giữa FSTS và năng suất lao động trong một năm khảo sát nhất định, không phải hiệu ứng nhân quả được theo dõi qua bảng. Chiến lược IV được sử dụng trong P3 Việt Nam để giải quyết sự lựa chọn vào xuất khẩu không có sẵn ở quy mô trên 34 nền kinh tế. Thứ hai, thước đo DAI giới hạn ở Tầng 1 (website) và Tầng 2 (thanh toán điện tử) trong hầu hết các đợt WBES; các chiều năng lực số phong phú hơn được nắm bắt trong các đợt lược đồ BEE gần đây chưa có sẵn cho đa số các nền kinh tế. Thứ ba, bộ dữ liệu bao trùm 45 nền kinh tế được ánh xạ ICRV qua sáu nhóm chế độ; đợt duy nhất hiện có của Oman (2003) thiếu các biến năng suất và cường độ xuất khẩu cốt lõi nên không đi vào mẫu ước lượng. Các đợt WBES tương lai của Oman sẽ làm sắc nét các ước tính Nhóm II.</w:t>
       </w:r>
     </w:p>
     <w:p>
@@ -2012,9 +2126,9 @@
         </w:pict>
       </w:r>
     </w:p>
-    <w:bookmarkEnd w:id="49"/>
     <w:bookmarkEnd w:id="50"/>
-    <w:bookmarkStart w:id="51" w:name="kết-luận"/>
+    <w:bookmarkEnd w:id="51"/>
+    <w:bookmarkStart w:id="52" w:name="kết-luận"/>
     <w:p>
       <w:pPr>
         <w:pStyle w:val="Heading2"/>
@@ -2028,7 +2142,7 @@
         <w:pStyle w:val="FirstParagraph"/>
       </w:pPr>
       <w:r>
-        <w:t xml:space="preserve">Nghiên cứu này không nhằm trả lời câu hỏi quốc tế hóa có sinh lợi hay không, mà là sinh lợi ở đâu và cho ai. Trên mẫu WBES gồm 48 nền kinh tế và 107 đợt khảo sát, mối quan hệ I–P hình chữ U ngược mang tính phổ quát về dạng thức — đạt đỉnh ở khoảng 36% cường độ xuất khẩu — song điểm tối ưu của nó lại được tái định vị một cách đồng thời bởi chế độ thể chế và năng lực số, và năng lực số vận hành như một nhân tố thay thế một phần cho sức mạnh thể chế. Ba hàm ý được rút ra. Đối với các doanh nghiệp ở nhánh lên (FSTS &lt; 36%), tăng cường quốc tế hóa giúp nâng năng suất và ưu tiên là gỡ bỏ các rào cản mở rộng xuất khẩu; vượt qua điểm tối ưu, ràng buộc cốt yếu là năng lực phối hợp chứ không phải tiếp cận thị trường. Năng lực công nghệ nâng mức hiệu quả ở mọi mức cường độ xuất khẩu mà không tái định vị điểm tối ưu một cách đáng tin cậy, vì vậy nên hiểu việc xây dựng năng lực như một đòn bẩy hiệu quả nền tảng hơn là một can thiệp dịch chuyển đường cong. Áp dụng số nền tảng vừa là nhân tố nâng cao mức độ vừa là nhân tố tái tạo đường cong, và lợi nhuận của nó lớn nhất ở nơi thể chế yếu nhất (DAI×ICRV, p = ,012) — khiến số hóa trở thành một công cụ có đòn bẩy đặc biệt cao ở các chế độ tiên phong và dễ tổn thương.</w:t>
+        <w:t xml:space="preserve">Nghiên cứu này không nhằm trả lời câu hỏi quốc tế hóa có sinh lợi hay không, mà là sinh lợi ở đâu và cho ai. Trên mẫu WBES gồm 45 nền kinh tế và 98 đợt khảo sát, mối quan hệ I–P hình chữ U ngược mang tính phổ quát về dạng thức — đạt đỉnh ở khoảng 37% cường độ xuất khẩu — song điểm tối ưu của nó lại được tái định vị một cách đồng thời bởi chế độ thể chế và năng lực số, và năng lực số vận hành như một nhân tố thay thế một phần cho sức mạnh thể chế. Ba hàm ý được rút ra. Đối với các doanh nghiệp ở nhánh lên (FSTS &lt; 36%), tăng cường quốc tế hóa giúp nâng năng suất và ưu tiên là gỡ bỏ các rào cản mở rộng xuất khẩu; vượt qua điểm tối ưu, ràng buộc cốt yếu là năng lực phối hợp chứ không phải tiếp cận thị trường. Năng lực công nghệ nâng mức hiệu quả ở mọi mức cường độ xuất khẩu mà không tái định vị điểm tối ưu một cách đáng tin cậy, vì vậy nên hiểu việc xây dựng năng lực như một đòn bẩy hiệu quả nền tảng hơn là một can thiệp dịch chuyển đường cong. Áp dụng số nền tảng vừa là nhân tố nâng cao mức độ vừa là nhân tố tái tạo đường cong, và lợi nhuận của nó lớn nhất ở nơi thể chế yếu nhất (DAI×ICRV, p = ,049) — khiến số hóa trở thành một công cụ có đòn bẩy đặc biệt cao ở các chế độ tiên phong và dễ tổn thương.</w:t>
       </w:r>
     </w:p>
     <w:p>
@@ -2054,8 +2168,8 @@
         </w:pict>
       </w:r>
     </w:p>
-    <w:bookmarkEnd w:id="51"/>
-    <w:bookmarkStart w:id="52" w:name="tài-liệu-tham-khảo"/>
+    <w:bookmarkEnd w:id="52"/>
+    <w:bookmarkStart w:id="53" w:name="tài-liệu-tham-khảo"/>
     <w:p>
       <w:pPr>
         <w:pStyle w:val="Heading2"/>
@@ -2198,6 +2312,30 @@
         <w:pStyle w:val="BodyText"/>
       </w:pPr>
       <w:r>
+        <w:t xml:space="preserve">Combs, J. G., Crook, T. R., &amp; Shook, C. L. (2005). The dimensionality of organizational performance and its implications for strategic management research. In D. J. Ketchen &amp; D. D. Bergh (Eds.),</w:t>
+      </w:r>
+      <w:r>
+        <w:t xml:space="preserve"> </w:t>
+      </w:r>
+      <w:r>
+        <w:rPr>
+          <w:iCs/>
+          <w:i/>
+        </w:rPr>
+        <w:t xml:space="preserve">Research methodology in strategy and management</w:t>
+      </w:r>
+      <w:r>
+        <w:t xml:space="preserve"> </w:t>
+      </w:r>
+      <w:r>
+        <w:t xml:space="preserve">(Vol. 2, pp. 259–286). Emerald. https://doi.org/10.1016/S1479-8387(05)02011-4</w:t>
+      </w:r>
+    </w:p>
+    <w:p>
+      <w:pPr>
+        <w:pStyle w:val="BodyText"/>
+      </w:pPr>
+      <w:r>
         <w:t xml:space="preserve">Cohen, W. M., &amp; Levinthal, D. A. (1990). Absorptive capacity: A new perspective on learning and innovation.</w:t>
       </w:r>
       <w:r>
@@ -2726,6 +2864,27 @@
         <w:pStyle w:val="BodyText"/>
       </w:pPr>
       <w:r>
+        <w:t xml:space="preserve">Richard, P. J., Devinney, T. M., Yip, G. S., &amp; Johnson, G. (2009). Measuring organizational performance: Towards methodological best practice.</w:t>
+      </w:r>
+      <w:r>
+        <w:t xml:space="preserve"> </w:t>
+      </w:r>
+      <w:r>
+        <w:rPr>
+          <w:iCs/>
+          <w:i/>
+        </w:rPr>
+        <w:t xml:space="preserve">Journal of Management, 35</w:t>
+      </w:r>
+      <w:r>
+        <w:t xml:space="preserve">(3), 718–804. https://doi.org/10.1177/0149206308330560</w:t>
+      </w:r>
+    </w:p>
+    <w:p>
+      <w:pPr>
+        <w:pStyle w:val="BodyText"/>
+      </w:pPr>
+      <w:r>
         <w:t xml:space="preserve">Scott, W. R. (2008).</w:t>
       </w:r>
       <w:r>
@@ -2792,6 +2951,27 @@
         <w:pStyle w:val="BodyText"/>
       </w:pPr>
       <w:r>
+        <w:t xml:space="preserve">United Nations Statistics Division. (2024).</w:t>
+      </w:r>
+      <w:r>
+        <w:t xml:space="preserve"> </w:t>
+      </w:r>
+      <w:r>
+        <w:rPr>
+          <w:iCs/>
+          <w:i/>
+        </w:rPr>
+        <w:t xml:space="preserve">Standard country or area codes for statistical use (M49)</w:t>
+      </w:r>
+      <w:r>
+        <w:t xml:space="preserve">. United Nations. https://unstats.un.org/unsd/methodology/m49/</w:t>
+      </w:r>
+    </w:p>
+    <w:p>
+      <w:pPr>
+        <w:pStyle w:val="BodyText"/>
+      </w:pPr>
+      <w:r>
         <w:t xml:space="preserve">Verhoef, P. C., Broekhuizen, T., Bart, Y., Bhattacharya, A., Dong, J. Q., Fabian, N., &amp; Haenlein, M. (2021). Digital transformation: A multidisciplinary reflection and research agenda.</w:t>
       </w:r>
       <w:r>
@@ -2827,6 +3007,27 @@
       </w:r>
       <w:r>
         <w:t xml:space="preserve">(2), 171–180. https://doi.org/10.1002/smj.4250050207</w:t>
+      </w:r>
+    </w:p>
+    <w:p>
+      <w:pPr>
+        <w:pStyle w:val="BodyText"/>
+      </w:pPr>
+      <w:r>
+        <w:t xml:space="preserve">World Bank. (2022).</w:t>
+      </w:r>
+      <w:r>
+        <w:t xml:space="preserve"> </w:t>
+      </w:r>
+      <w:r>
+        <w:rPr>
+          <w:iCs/>
+          <w:i/>
+        </w:rPr>
+        <w:t xml:space="preserve">Enterprise surveys: Sampling methodology</w:t>
+      </w:r>
+      <w:r>
+        <w:t xml:space="preserve">. World Bank Group. https://www.enterprisesurveys.org</w:t>
       </w:r>
     </w:p>
     <w:p>
@@ -3013,8 +3214,8 @@
         </w:pict>
       </w:r>
     </w:p>
-    <w:bookmarkEnd w:id="52"/>
-    <w:bookmarkStart w:id="53" w:name="phụ-lục-a-chuỗi-mô-hình"/>
+    <w:bookmarkEnd w:id="53"/>
+    <w:bookmarkStart w:id="54" w:name="phụ-lục-a-chuỗi-mô-hình"/>
     <w:p>
       <w:pPr>
         <w:pStyle w:val="Heading2"/>
@@ -3777,7 +3978,7 @@
               <w:jc w:val="left"/>
             </w:pPr>
             <w:r>
-              <w:t xml:space="preserve">84.910</w:t>
+              <w:t xml:space="preserve">82.302</w:t>
             </w:r>
           </w:p>
         </w:tc>
@@ -3851,7 +4052,7 @@
               <w:jc w:val="left"/>
             </w:pPr>
             <w:r>
-              <w:t xml:space="preserve">84.910</w:t>
+              <w:t xml:space="preserve">82.302</w:t>
             </w:r>
           </w:p>
         </w:tc>
@@ -3925,19 +4126,19 @@
               <w:jc w:val="left"/>
             </w:pPr>
             <w:r>
-              <w:t xml:space="preserve">84.910</w:t>
-            </w:r>
-          </w:p>
-        </w:tc>
-        <w:tc>
-          <w:tcPr/>
-          <w:p>
-            <w:pPr>
-              <w:pStyle w:val="Compact"/>
-              <w:jc w:val="left"/>
-            </w:pPr>
-            <w:r>
-              <w:t xml:space="preserve">,003</w:t>
+              <w:t xml:space="preserve">82.302</w:t>
+            </w:r>
+          </w:p>
+        </w:tc>
+        <w:tc>
+          <w:tcPr/>
+          <w:p>
+            <w:pPr>
+              <w:pStyle w:val="Compact"/>
+              <w:jc w:val="left"/>
+            </w:pPr>
+            <w:r>
+              <w:t xml:space="preserve">,002</w:t>
             </w:r>
           </w:p>
         </w:tc>
@@ -3953,7 +4154,7 @@
                 <w:bCs/>
                 <w:b/>
               </w:rPr>
-              <w:t xml:space="preserve">36,4</w:t>
+              <w:t xml:space="preserve">37,1</w:t>
             </w:r>
           </w:p>
         </w:tc>
@@ -4003,19 +4204,19 @@
               <w:jc w:val="left"/>
             </w:pPr>
             <w:r>
-              <w:t xml:space="preserve">38.342</w:t>
-            </w:r>
-          </w:p>
-        </w:tc>
-        <w:tc>
-          <w:tcPr/>
-          <w:p>
-            <w:pPr>
-              <w:pStyle w:val="Compact"/>
-              <w:jc w:val="left"/>
-            </w:pPr>
-            <w:r>
-              <w:t xml:space="preserve">,015</w:t>
+              <w:t xml:space="preserve">36.772</w:t>
+            </w:r>
+          </w:p>
+        </w:tc>
+        <w:tc>
+          <w:tcPr/>
+          <w:p>
+            <w:pPr>
+              <w:pStyle w:val="Compact"/>
+              <w:jc w:val="left"/>
+            </w:pPr>
+            <w:r>
+              <w:t xml:space="preserve">,017</w:t>
             </w:r>
           </w:p>
         </w:tc>
@@ -4031,7 +4232,7 @@
                 <w:bCs/>
                 <w:b/>
               </w:rPr>
-              <w:t xml:space="preserve">33,8</w:t>
+              <w:t xml:space="preserve">34,1</w:t>
             </w:r>
           </w:p>
         </w:tc>
@@ -4081,19 +4282,19 @@
               <w:jc w:val="left"/>
             </w:pPr>
             <w:r>
-              <w:t xml:space="preserve">38.342</w:t>
-            </w:r>
-          </w:p>
-        </w:tc>
-        <w:tc>
-          <w:tcPr/>
-          <w:p>
-            <w:pPr>
-              <w:pStyle w:val="Compact"/>
-              <w:jc w:val="left"/>
-            </w:pPr>
-            <w:r>
-              <w:t xml:space="preserve">,677</w:t>
+              <w:t xml:space="preserve">36.772</w:t>
+            </w:r>
+          </w:p>
+        </w:tc>
+        <w:tc>
+          <w:tcPr/>
+          <w:p>
+            <w:pPr>
+              <w:pStyle w:val="Compact"/>
+              <w:jc w:val="left"/>
+            </w:pPr>
+            <w:r>
+              <w:t xml:space="preserve">,671</w:t>
             </w:r>
           </w:p>
         </w:tc>
@@ -4109,7 +4310,7 @@
                 <w:bCs/>
                 <w:b/>
               </w:rPr>
-              <w:t xml:space="preserve">40,0</w:t>
+              <w:t xml:space="preserve">39,5</w:t>
             </w:r>
           </w:p>
         </w:tc>
@@ -4159,31 +4360,31 @@
               <w:jc w:val="left"/>
             </w:pPr>
             <w:r>
-              <w:t xml:space="preserve">38.051</w:t>
-            </w:r>
-          </w:p>
-        </w:tc>
-        <w:tc>
-          <w:tcPr/>
-          <w:p>
-            <w:pPr>
-              <w:pStyle w:val="Compact"/>
-              <w:jc w:val="left"/>
-            </w:pPr>
-            <w:r>
-              <w:t xml:space="preserve">,024</w:t>
-            </w:r>
-          </w:p>
-        </w:tc>
-        <w:tc>
-          <w:tcPr/>
-          <w:p>
-            <w:pPr>
-              <w:pStyle w:val="Compact"/>
-              <w:jc w:val="left"/>
-            </w:pPr>
-            <w:r>
-              <w:t xml:space="preserve">32,7</w:t>
+              <w:t xml:space="preserve">36.481</w:t>
+            </w:r>
+          </w:p>
+        </w:tc>
+        <w:tc>
+          <w:tcPr/>
+          <w:p>
+            <w:pPr>
+              <w:pStyle w:val="Compact"/>
+              <w:jc w:val="left"/>
+            </w:pPr>
+            <w:r>
+              <w:t xml:space="preserve">,027</w:t>
+            </w:r>
+          </w:p>
+        </w:tc>
+        <w:tc>
+          <w:tcPr/>
+          <w:p>
+            <w:pPr>
+              <w:pStyle w:val="Compact"/>
+              <w:jc w:val="left"/>
+            </w:pPr>
+            <w:r>
+              <w:t xml:space="preserve">33,0</w:t>
             </w:r>
           </w:p>
         </w:tc>
@@ -4233,19 +4434,19 @@
               <w:jc w:val="left"/>
             </w:pPr>
             <w:r>
-              <w:t xml:space="preserve">38.051</w:t>
-            </w:r>
-          </w:p>
-        </w:tc>
-        <w:tc>
-          <w:tcPr/>
-          <w:p>
-            <w:pPr>
-              <w:pStyle w:val="Compact"/>
-              <w:jc w:val="left"/>
-            </w:pPr>
-            <w:r>
-              <w:t xml:space="preserve">,025</w:t>
+              <w:t xml:space="preserve">36.481</w:t>
+            </w:r>
+          </w:p>
+        </w:tc>
+        <w:tc>
+          <w:tcPr/>
+          <w:p>
+            <w:pPr>
+              <w:pStyle w:val="Compact"/>
+              <w:jc w:val="left"/>
+            </w:pPr>
+            <w:r>
+              <w:t xml:space="preserve">,028</w:t>
             </w:r>
           </w:p>
         </w:tc>
@@ -4261,7 +4462,7 @@
                 <w:bCs/>
                 <w:b/>
               </w:rPr>
-              <w:t xml:space="preserve">33,9</w:t>
+              <w:t xml:space="preserve">34,2</w:t>
             </w:r>
           </w:p>
         </w:tc>
@@ -4311,19 +4512,19 @@
               <w:jc w:val="left"/>
             </w:pPr>
             <w:r>
-              <w:t xml:space="preserve">37.940</w:t>
-            </w:r>
-          </w:p>
-        </w:tc>
-        <w:tc>
-          <w:tcPr/>
-          <w:p>
-            <w:pPr>
-              <w:pStyle w:val="Compact"/>
-              <w:jc w:val="left"/>
-            </w:pPr>
-            <w:r>
-              <w:t xml:space="preserve">,030</w:t>
+              <w:t xml:space="preserve">36.372</w:t>
+            </w:r>
+          </w:p>
+        </w:tc>
+        <w:tc>
+          <w:tcPr/>
+          <w:p>
+            <w:pPr>
+              <w:pStyle w:val="Compact"/>
+              <w:jc w:val="left"/>
+            </w:pPr>
+            <w:r>
+              <w:t xml:space="preserve">,033</w:t>
             </w:r>
           </w:p>
         </w:tc>
@@ -4339,7 +4540,7 @@
                 <w:bCs/>
                 <w:b/>
               </w:rPr>
-              <w:t xml:space="preserve">33,8</w:t>
+              <w:t xml:space="preserve">34,2</w:t>
             </w:r>
           </w:p>
         </w:tc>
@@ -4389,19 +4590,19 @@
               <w:jc w:val="left"/>
             </w:pPr>
             <w:r>
-              <w:t xml:space="preserve">35.568</w:t>
-            </w:r>
-          </w:p>
-        </w:tc>
-        <w:tc>
-          <w:tcPr/>
-          <w:p>
-            <w:pPr>
-              <w:pStyle w:val="Compact"/>
-              <w:jc w:val="left"/>
-            </w:pPr>
-            <w:r>
-              <w:t xml:space="preserve">,035</w:t>
+              <w:t xml:space="preserve">34.228</w:t>
+            </w:r>
+          </w:p>
+        </w:tc>
+        <w:tc>
+          <w:tcPr/>
+          <w:p>
+            <w:pPr>
+              <w:pStyle w:val="Compact"/>
+              <w:jc w:val="left"/>
+            </w:pPr>
+            <w:r>
+              <w:t xml:space="preserve">,042</w:t>
             </w:r>
           </w:p>
         </w:tc>
@@ -4417,7 +4618,7 @@
                 <w:bCs/>
                 <w:b/>
               </w:rPr>
-              <w:t xml:space="preserve">36,1</w:t>
+              <w:t xml:space="preserve">32,2</w:t>
             </w:r>
           </w:p>
         </w:tc>
@@ -4467,19 +4668,19 @@
               <w:jc w:val="left"/>
             </w:pPr>
             <w:r>
-              <w:t xml:space="preserve">31.928</w:t>
-            </w:r>
-          </w:p>
-        </w:tc>
-        <w:tc>
-          <w:tcPr/>
-          <w:p>
-            <w:pPr>
-              <w:pStyle w:val="Compact"/>
-              <w:jc w:val="left"/>
-            </w:pPr>
-            <w:r>
-              <w:t xml:space="preserve">,049</w:t>
+              <w:t xml:space="preserve">30.360</w:t>
+            </w:r>
+          </w:p>
+        </w:tc>
+        <w:tc>
+          <w:tcPr/>
+          <w:p>
+            <w:pPr>
+              <w:pStyle w:val="Compact"/>
+              <w:jc w:val="left"/>
+            </w:pPr>
+            <w:r>
+              <w:t xml:space="preserve">,039</w:t>
             </w:r>
           </w:p>
         </w:tc>
@@ -4541,19 +4742,19 @@
               <w:jc w:val="left"/>
             </w:pPr>
             <w:r>
-              <w:t xml:space="preserve">29.840</w:t>
-            </w:r>
-          </w:p>
-        </w:tc>
-        <w:tc>
-          <w:tcPr/>
-          <w:p>
-            <w:pPr>
-              <w:pStyle w:val="Compact"/>
-              <w:jc w:val="left"/>
-            </w:pPr>
-            <w:r>
-              <w:t xml:space="preserve">,067</w:t>
+              <w:t xml:space="preserve">28.500</w:t>
+            </w:r>
+          </w:p>
+        </w:tc>
+        <w:tc>
+          <w:tcPr/>
+          <w:p>
+            <w:pPr>
+              <w:pStyle w:val="Compact"/>
+              <w:jc w:val="left"/>
+            </w:pPr>
+            <w:r>
+              <w:t xml:space="preserve">,057</w:t>
             </w:r>
           </w:p>
         </w:tc>
@@ -4569,19 +4770,19 @@
                 <w:bCs/>
                 <w:b/>
               </w:rPr>
-              <w:t xml:space="preserve">34,6</w:t>
-            </w:r>
-          </w:p>
-        </w:tc>
-        <w:tc>
-          <w:tcPr/>
-          <w:p>
-            <w:pPr>
-              <w:pStyle w:val="Compact"/>
-              <w:jc w:val="left"/>
-            </w:pPr>
-            <w:r>
-              <w:t xml:space="preserve">,002</w:t>
+              <w:t xml:space="preserve">25,7</w:t>
+            </w:r>
+          </w:p>
+        </w:tc>
+        <w:tc>
+          <w:tcPr/>
+          <w:p>
+            <w:pPr>
+              <w:pStyle w:val="Compact"/>
+              <w:jc w:val="left"/>
+            </w:pPr>
+            <w:r>
+              <w:t xml:space="preserve">,026</w:t>
             </w:r>
           </w:p>
         </w:tc>
@@ -4742,55 +4943,55 @@
               <w:jc w:val="left"/>
             </w:pPr>
             <w:r>
-              <w:t xml:space="preserve">+1,316***</w:t>
-            </w:r>
-          </w:p>
-        </w:tc>
-        <w:tc>
-          <w:tcPr/>
-          <w:p>
-            <w:pPr>
-              <w:pStyle w:val="Compact"/>
-              <w:jc w:val="left"/>
-            </w:pPr>
-            <w:r>
-              <w:t xml:space="preserve">+2,083***</w:t>
-            </w:r>
-          </w:p>
-        </w:tc>
-        <w:tc>
-          <w:tcPr/>
-          <w:p>
-            <w:pPr>
-              <w:pStyle w:val="Compact"/>
-              <w:jc w:val="left"/>
-            </w:pPr>
-            <w:r>
-              <w:t xml:space="preserve">+2,000***</w:t>
-            </w:r>
-          </w:p>
-        </w:tc>
-        <w:tc>
-          <w:tcPr/>
-          <w:p>
-            <w:pPr>
-              <w:pStyle w:val="Compact"/>
-              <w:jc w:val="left"/>
-            </w:pPr>
-            <w:r>
-              <w:t xml:space="preserve">+2,522***</w:t>
-            </w:r>
-          </w:p>
-        </w:tc>
-        <w:tc>
-          <w:tcPr/>
-          <w:p>
-            <w:pPr>
-              <w:pStyle w:val="Compact"/>
-              <w:jc w:val="left"/>
-            </w:pPr>
-            <w:r>
-              <w:t xml:space="preserve">−5,560***</w:t>
+              <w:t xml:space="preserve">+1,211***</w:t>
+            </w:r>
+          </w:p>
+        </w:tc>
+        <w:tc>
+          <w:tcPr/>
+          <w:p>
+            <w:pPr>
+              <w:pStyle w:val="Compact"/>
+              <w:jc w:val="left"/>
+            </w:pPr>
+            <w:r>
+              <w:t xml:space="preserve">+2,249***</w:t>
+            </w:r>
+          </w:p>
+        </w:tc>
+        <w:tc>
+          <w:tcPr/>
+          <w:p>
+            <w:pPr>
+              <w:pStyle w:val="Compact"/>
+              <w:jc w:val="left"/>
+            </w:pPr>
+            <w:r>
+              <w:t xml:space="preserve">+2,154***</w:t>
+            </w:r>
+          </w:p>
+        </w:tc>
+        <w:tc>
+          <w:tcPr/>
+          <w:p>
+            <w:pPr>
+              <w:pStyle w:val="Compact"/>
+              <w:jc w:val="left"/>
+            </w:pPr>
+            <w:r>
+              <w:t xml:space="preserve">+2,429***</w:t>
+            </w:r>
+          </w:p>
+        </w:tc>
+        <w:tc>
+          <w:tcPr/>
+          <w:p>
+            <w:pPr>
+              <w:pStyle w:val="Compact"/>
+              <w:jc w:val="left"/>
+            </w:pPr>
+            <w:r>
+              <w:t xml:space="preserve">−6,497***</w:t>
             </w:r>
           </w:p>
         </w:tc>
@@ -4816,55 +5017,55 @@
               <w:jc w:val="left"/>
             </w:pPr>
             <w:r>
-              <w:t xml:space="preserve">−1,810***</w:t>
-            </w:r>
-          </w:p>
-        </w:tc>
-        <w:tc>
-          <w:tcPr/>
-          <w:p>
-            <w:pPr>
-              <w:pStyle w:val="Compact"/>
-              <w:jc w:val="left"/>
-            </w:pPr>
-            <w:r>
-              <w:t xml:space="preserve">−3,074***</w:t>
-            </w:r>
-          </w:p>
-        </w:tc>
-        <w:tc>
-          <w:tcPr/>
-          <w:p>
-            <w:pPr>
-              <w:pStyle w:val="Compact"/>
-              <w:jc w:val="left"/>
-            </w:pPr>
-            <w:r>
-              <w:t xml:space="preserve">−2,954***</w:t>
-            </w:r>
-          </w:p>
-        </w:tc>
-        <w:tc>
-          <w:tcPr/>
-          <w:p>
-            <w:pPr>
-              <w:pStyle w:val="Compact"/>
-              <w:jc w:val="left"/>
-            </w:pPr>
-            <w:r>
-              <w:t xml:space="preserve">−3,497***</w:t>
-            </w:r>
-          </w:p>
-        </w:tc>
-        <w:tc>
-          <w:tcPr/>
-          <w:p>
-            <w:pPr>
-              <w:pStyle w:val="Compact"/>
-              <w:jc w:val="left"/>
-            </w:pPr>
-            <w:r>
-              <w:t xml:space="preserve">+8,517***</w:t>
+              <w:t xml:space="preserve">−1,630***</w:t>
+            </w:r>
+          </w:p>
+        </w:tc>
+        <w:tc>
+          <w:tcPr/>
+          <w:p>
+            <w:pPr>
+              <w:pStyle w:val="Compact"/>
+              <w:jc w:val="left"/>
+            </w:pPr>
+            <w:r>
+              <w:t xml:space="preserve">−3,287***</w:t>
+            </w:r>
+          </w:p>
+        </w:tc>
+        <w:tc>
+          <w:tcPr/>
+          <w:p>
+            <w:pPr>
+              <w:pStyle w:val="Compact"/>
+              <w:jc w:val="left"/>
+            </w:pPr>
+            <w:r>
+              <w:t xml:space="preserve">−3,147***</w:t>
+            </w:r>
+          </w:p>
+        </w:tc>
+        <w:tc>
+          <w:tcPr/>
+          <w:p>
+            <w:pPr>
+              <w:pStyle w:val="Compact"/>
+              <w:jc w:val="left"/>
+            </w:pPr>
+            <w:r>
+              <w:t xml:space="preserve">−3,768***</w:t>
+            </w:r>
+          </w:p>
+        </w:tc>
+        <w:tc>
+          <w:tcPr/>
+          <w:p>
+            <w:pPr>
+              <w:pStyle w:val="Compact"/>
+              <w:jc w:val="left"/>
+            </w:pPr>
+            <w:r>
+              <w:t xml:space="preserve">+10,449***</w:t>
             </w:r>
           </w:p>
         </w:tc>
@@ -4902,43 +5103,43 @@
               <w:jc w:val="left"/>
             </w:pPr>
             <w:r>
-              <w:t xml:space="preserve">+0,344***</w:t>
-            </w:r>
-          </w:p>
-        </w:tc>
-        <w:tc>
-          <w:tcPr/>
-          <w:p>
-            <w:pPr>
-              <w:pStyle w:val="Compact"/>
-              <w:jc w:val="left"/>
-            </w:pPr>
-            <w:r>
-              <w:t xml:space="preserve">+0,307***</w:t>
-            </w:r>
-          </w:p>
-        </w:tc>
-        <w:tc>
-          <w:tcPr/>
-          <w:p>
-            <w:pPr>
-              <w:pStyle w:val="Compact"/>
-              <w:jc w:val="left"/>
-            </w:pPr>
-            <w:r>
-              <w:t xml:space="preserve">+0,304***</w:t>
-            </w:r>
-          </w:p>
-        </w:tc>
-        <w:tc>
-          <w:tcPr/>
-          <w:p>
-            <w:pPr>
-              <w:pStyle w:val="Compact"/>
-              <w:jc w:val="left"/>
-            </w:pPr>
-            <w:r>
-              <w:t xml:space="preserve">+0,256***</w:t>
+              <w:t xml:space="preserve">+0,372***</w:t>
+            </w:r>
+          </w:p>
+        </w:tc>
+        <w:tc>
+          <w:tcPr/>
+          <w:p>
+            <w:pPr>
+              <w:pStyle w:val="Compact"/>
+              <w:jc w:val="left"/>
+            </w:pPr>
+            <w:r>
+              <w:t xml:space="preserve">+0,330***</w:t>
+            </w:r>
+          </w:p>
+        </w:tc>
+        <w:tc>
+          <w:tcPr/>
+          <w:p>
+            <w:pPr>
+              <w:pStyle w:val="Compact"/>
+              <w:jc w:val="left"/>
+            </w:pPr>
+            <w:r>
+              <w:t xml:space="preserve">+0,326***</w:t>
+            </w:r>
+          </w:p>
+        </w:tc>
+        <w:tc>
+          <w:tcPr/>
+          <w:p>
+            <w:pPr>
+              <w:pStyle w:val="Compact"/>
+              <w:jc w:val="left"/>
+            </w:pPr>
+            <w:r>
+              <w:t xml:space="preserve">+0,279***</w:t>
             </w:r>
           </w:p>
         </w:tc>
@@ -4976,31 +5177,31 @@
               <w:jc w:val="left"/>
             </w:pPr>
             <w:r>
-              <w:t xml:space="preserve">−0,144</w:t>
-            </w:r>
-          </w:p>
-        </w:tc>
-        <w:tc>
-          <w:tcPr/>
-          <w:p>
-            <w:pPr>
-              <w:pStyle w:val="Compact"/>
-              <w:jc w:val="left"/>
-            </w:pPr>
-            <w:r>
-              <w:t xml:space="preserve">+0,113</w:t>
-            </w:r>
-          </w:p>
-        </w:tc>
-        <w:tc>
-          <w:tcPr/>
-          <w:p>
-            <w:pPr>
-              <w:pStyle w:val="Compact"/>
-              <w:jc w:val="left"/>
-            </w:pPr>
-            <w:r>
-              <w:t xml:space="preserve">+0,134</w:t>
+              <w:t xml:space="preserve">−0,090</w:t>
+            </w:r>
+          </w:p>
+        </w:tc>
+        <w:tc>
+          <w:tcPr/>
+          <w:p>
+            <w:pPr>
+              <w:pStyle w:val="Compact"/>
+              <w:jc w:val="left"/>
+            </w:pPr>
+            <w:r>
+              <w:t xml:space="preserve">+0,159</w:t>
+            </w:r>
+          </w:p>
+        </w:tc>
+        <w:tc>
+          <w:tcPr/>
+          <w:p>
+            <w:pPr>
+              <w:pStyle w:val="Compact"/>
+              <w:jc w:val="left"/>
+            </w:pPr>
+            <w:r>
+              <w:t xml:space="preserve">+0,158</w:t>
             </w:r>
           </w:p>
         </w:tc>
@@ -5050,31 +5251,31 @@
               <w:jc w:val="left"/>
             </w:pPr>
             <w:r>
-              <w:t xml:space="preserve">−0,137</w:t>
-            </w:r>
-          </w:p>
-        </w:tc>
-        <w:tc>
-          <w:tcPr/>
-          <w:p>
-            <w:pPr>
-              <w:pStyle w:val="Compact"/>
-              <w:jc w:val="left"/>
-            </w:pPr>
-            <w:r>
-              <w:t xml:space="preserve">−0,418</w:t>
-            </w:r>
-          </w:p>
-        </w:tc>
-        <w:tc>
-          <w:tcPr/>
-          <w:p>
-            <w:pPr>
-              <w:pStyle w:val="Compact"/>
-              <w:jc w:val="left"/>
-            </w:pPr>
-            <w:r>
-              <w:t xml:space="preserve">−0,398</w:t>
+              <w:t xml:space="preserve">−0,227</w:t>
+            </w:r>
+          </w:p>
+        </w:tc>
+        <w:tc>
+          <w:tcPr/>
+          <w:p>
+            <w:pPr>
+              <w:pStyle w:val="Compact"/>
+              <w:jc w:val="left"/>
+            </w:pPr>
+            <w:r>
+              <w:t xml:space="preserve">−0,493†</w:t>
+            </w:r>
+          </w:p>
+        </w:tc>
+        <w:tc>
+          <w:tcPr/>
+          <w:p>
+            <w:pPr>
+              <w:pStyle w:val="Compact"/>
+              <w:jc w:val="left"/>
+            </w:pPr>
+            <w:r>
+              <w:t xml:space="preserve">−0,433</w:t>
             </w:r>
           </w:p>
         </w:tc>
@@ -5136,31 +5337,31 @@
               <w:jc w:val="left"/>
             </w:pPr>
             <w:r>
-              <w:t xml:space="preserve">+0,155***</w:t>
-            </w:r>
-          </w:p>
-        </w:tc>
-        <w:tc>
-          <w:tcPr/>
-          <w:p>
-            <w:pPr>
-              <w:pStyle w:val="Compact"/>
-              <w:jc w:val="left"/>
-            </w:pPr>
-            <w:r>
-              <w:t xml:space="preserve">+0,145***</w:t>
-            </w:r>
-          </w:p>
-        </w:tc>
-        <w:tc>
-          <w:tcPr/>
-          <w:p>
-            <w:pPr>
-              <w:pStyle w:val="Compact"/>
-              <w:jc w:val="left"/>
-            </w:pPr>
-            <w:r>
-              <w:t xml:space="preserve">+0,181***</w:t>
+              <w:t xml:space="preserve">+0,172***</w:t>
+            </w:r>
+          </w:p>
+        </w:tc>
+        <w:tc>
+          <w:tcPr/>
+          <w:p>
+            <w:pPr>
+              <w:pStyle w:val="Compact"/>
+              <w:jc w:val="left"/>
+            </w:pPr>
+            <w:r>
+              <w:t xml:space="preserve">+0,160***</w:t>
+            </w:r>
+          </w:p>
+        </w:tc>
+        <w:tc>
+          <w:tcPr/>
+          <w:p>
+            <w:pPr>
+              <w:pStyle w:val="Compact"/>
+              <w:jc w:val="left"/>
+            </w:pPr>
+            <w:r>
+              <w:t xml:space="preserve">+0,198***</w:t>
             </w:r>
           </w:p>
         </w:tc>
@@ -5210,19 +5411,19 @@
               <w:jc w:val="left"/>
             </w:pPr>
             <w:r>
-              <w:t xml:space="preserve">−0,614***</w:t>
-            </w:r>
-          </w:p>
-        </w:tc>
-        <w:tc>
-          <w:tcPr/>
-          <w:p>
-            <w:pPr>
-              <w:pStyle w:val="Compact"/>
-              <w:jc w:val="left"/>
-            </w:pPr>
-            <w:r>
-              <w:t xml:space="preserve">−0,780***</w:t>
+              <w:t xml:space="preserve">−0,588***</w:t>
+            </w:r>
+          </w:p>
+        </w:tc>
+        <w:tc>
+          <w:tcPr/>
+          <w:p>
+            <w:pPr>
+              <w:pStyle w:val="Compact"/>
+              <w:jc w:val="left"/>
+            </w:pPr>
+            <w:r>
+              <w:t xml:space="preserve">−0,786***</w:t>
             </w:r>
           </w:p>
         </w:tc>
@@ -5284,19 +5485,19 @@
               <w:jc w:val="left"/>
             </w:pPr>
             <w:r>
-              <w:t xml:space="preserve">+0,766**</w:t>
-            </w:r>
-          </w:p>
-        </w:tc>
-        <w:tc>
-          <w:tcPr/>
-          <w:p>
-            <w:pPr>
-              <w:pStyle w:val="Compact"/>
-              <w:jc w:val="left"/>
-            </w:pPr>
-            <w:r>
-              <w:t xml:space="preserve">+0,994***</w:t>
+              <w:t xml:space="preserve">+0,726**</w:t>
+            </w:r>
+          </w:p>
+        </w:tc>
+        <w:tc>
+          <w:tcPr/>
+          <w:p>
+            <w:pPr>
+              <w:pStyle w:val="Compact"/>
+              <w:jc w:val="left"/>
+            </w:pPr>
+            <w:r>
+              <w:t xml:space="preserve">+0,982***</w:t>
             </w:r>
           </w:p>
         </w:tc>
@@ -5370,7 +5571,7 @@
               <w:jc w:val="left"/>
             </w:pPr>
             <w:r>
-              <w:t xml:space="preserve">+0,007*</w:t>
+              <w:t xml:space="preserve">+0,018***</w:t>
             </w:r>
           </w:p>
         </w:tc>
@@ -5444,7 +5645,7 @@
               <w:jc w:val="left"/>
             </w:pPr>
             <w:r>
-              <w:t xml:space="preserve">+0,185***</w:t>
+              <w:t xml:space="preserve">+0,202***</w:t>
             </w:r>
           </w:p>
         </w:tc>
@@ -5530,7 +5731,7 @@
               <w:jc w:val="left"/>
             </w:pPr>
             <w:r>
-              <w:t xml:space="preserve">+0,729***</w:t>
+              <w:t xml:space="preserve">+0,592***</w:t>
             </w:r>
           </w:p>
         </w:tc>
@@ -5604,7 +5805,7 @@
               <w:jc w:val="left"/>
             </w:pPr>
             <w:r>
-              <w:t xml:space="preserve">+1,636***</w:t>
+              <w:t xml:space="preserve">+1,849***</w:t>
             </w:r>
           </w:p>
         </w:tc>
@@ -5678,7 +5879,7 @@
               <w:jc w:val="left"/>
             </w:pPr>
             <w:r>
-              <w:t xml:space="preserve">−2,501***</w:t>
+              <w:t xml:space="preserve">−2,932***</w:t>
             </w:r>
           </w:p>
         </w:tc>
@@ -5704,55 +5905,55 @@
               <w:jc w:val="left"/>
             </w:pPr>
             <w:r>
-              <w:t xml:space="preserve">84.910</w:t>
-            </w:r>
-          </w:p>
-        </w:tc>
-        <w:tc>
-          <w:tcPr/>
-          <w:p>
-            <w:pPr>
-              <w:pStyle w:val="Compact"/>
-              <w:jc w:val="left"/>
-            </w:pPr>
-            <w:r>
-              <w:t xml:space="preserve">38.051</w:t>
-            </w:r>
-          </w:p>
-        </w:tc>
-        <w:tc>
-          <w:tcPr/>
-          <w:p>
-            <w:pPr>
-              <w:pStyle w:val="Compact"/>
-              <w:jc w:val="left"/>
-            </w:pPr>
-            <w:r>
-              <w:t xml:space="preserve">37.940</w:t>
-            </w:r>
-          </w:p>
-        </w:tc>
-        <w:tc>
-          <w:tcPr/>
-          <w:p>
-            <w:pPr>
-              <w:pStyle w:val="Compact"/>
-              <w:jc w:val="left"/>
-            </w:pPr>
-            <w:r>
-              <w:t xml:space="preserve">35.568</w:t>
-            </w:r>
-          </w:p>
-        </w:tc>
-        <w:tc>
-          <w:tcPr/>
-          <w:p>
-            <w:pPr>
-              <w:pStyle w:val="Compact"/>
-              <w:jc w:val="left"/>
-            </w:pPr>
-            <w:r>
-              <w:t xml:space="preserve">31.928</w:t>
+              <w:t xml:space="preserve">82.302</w:t>
+            </w:r>
+          </w:p>
+        </w:tc>
+        <w:tc>
+          <w:tcPr/>
+          <w:p>
+            <w:pPr>
+              <w:pStyle w:val="Compact"/>
+              <w:jc w:val="left"/>
+            </w:pPr>
+            <w:r>
+              <w:t xml:space="preserve">36.481</w:t>
+            </w:r>
+          </w:p>
+        </w:tc>
+        <w:tc>
+          <w:tcPr/>
+          <w:p>
+            <w:pPr>
+              <w:pStyle w:val="Compact"/>
+              <w:jc w:val="left"/>
+            </w:pPr>
+            <w:r>
+              <w:t xml:space="preserve">36.372</w:t>
+            </w:r>
+          </w:p>
+        </w:tc>
+        <w:tc>
+          <w:tcPr/>
+          <w:p>
+            <w:pPr>
+              <w:pStyle w:val="Compact"/>
+              <w:jc w:val="left"/>
+            </w:pPr>
+            <w:r>
+              <w:t xml:space="preserve">34.228</w:t>
+            </w:r>
+          </w:p>
+        </w:tc>
+        <w:tc>
+          <w:tcPr/>
+          <w:p>
+            <w:pPr>
+              <w:pStyle w:val="Compact"/>
+              <w:jc w:val="left"/>
+            </w:pPr>
+            <w:r>
+              <w:t xml:space="preserve">30.360</w:t>
             </w:r>
           </w:p>
         </w:tc>
@@ -5778,55 +5979,55 @@
               <w:jc w:val="left"/>
             </w:pPr>
             <w:r>
-              <w:t xml:space="preserve">,003</w:t>
-            </w:r>
-          </w:p>
-        </w:tc>
-        <w:tc>
-          <w:tcPr/>
-          <w:p>
-            <w:pPr>
-              <w:pStyle w:val="Compact"/>
-              <w:jc w:val="left"/>
-            </w:pPr>
-            <w:r>
-              <w:t xml:space="preserve">,025</w:t>
-            </w:r>
-          </w:p>
-        </w:tc>
-        <w:tc>
-          <w:tcPr/>
-          <w:p>
-            <w:pPr>
-              <w:pStyle w:val="Compact"/>
-              <w:jc w:val="left"/>
-            </w:pPr>
-            <w:r>
-              <w:t xml:space="preserve">,030</w:t>
-            </w:r>
-          </w:p>
-        </w:tc>
-        <w:tc>
-          <w:tcPr/>
-          <w:p>
-            <w:pPr>
-              <w:pStyle w:val="Compact"/>
-              <w:jc w:val="left"/>
-            </w:pPr>
-            <w:r>
-              <w:t xml:space="preserve">,035</w:t>
-            </w:r>
-          </w:p>
-        </w:tc>
-        <w:tc>
-          <w:tcPr/>
-          <w:p>
-            <w:pPr>
-              <w:pStyle w:val="Compact"/>
-              <w:jc w:val="left"/>
-            </w:pPr>
-            <w:r>
-              <w:t xml:space="preserve">,049</w:t>
+              <w:t xml:space="preserve">,002</w:t>
+            </w:r>
+          </w:p>
+        </w:tc>
+        <w:tc>
+          <w:tcPr/>
+          <w:p>
+            <w:pPr>
+              <w:pStyle w:val="Compact"/>
+              <w:jc w:val="left"/>
+            </w:pPr>
+            <w:r>
+              <w:t xml:space="preserve">,028</w:t>
+            </w:r>
+          </w:p>
+        </w:tc>
+        <w:tc>
+          <w:tcPr/>
+          <w:p>
+            <w:pPr>
+              <w:pStyle w:val="Compact"/>
+              <w:jc w:val="left"/>
+            </w:pPr>
+            <w:r>
+              <w:t xml:space="preserve">,033</w:t>
+            </w:r>
+          </w:p>
+        </w:tc>
+        <w:tc>
+          <w:tcPr/>
+          <w:p>
+            <w:pPr>
+              <w:pStyle w:val="Compact"/>
+              <w:jc w:val="left"/>
+            </w:pPr>
+            <w:r>
+              <w:t xml:space="preserve">,042</w:t>
+            </w:r>
+          </w:p>
+        </w:tc>
+        <w:tc>
+          <w:tcPr/>
+          <w:p>
+            <w:pPr>
+              <w:pStyle w:val="Compact"/>
+              <w:jc w:val="left"/>
+            </w:pPr>
+            <w:r>
+              <w:t xml:space="preserve">,039</w:t>
             </w:r>
           </w:p>
         </w:tc>
@@ -5847,26 +6048,24 @@
         <w:t xml:space="preserve"> </w:t>
       </w:r>
       <w:r>
-        <w:t xml:space="preserve">Sai số chuẩn vững HC1. *** p &lt; ,001, ** p &lt; ,01, * p &lt; ,05, † p &lt; ,10. Biến kiểm soát (female_owner, foreign_own_pct, firm_age, ln_size) được bao gồm trong M7–M10 nhưng không báo cáo vì tiết kiệm không gian. M11 (N = 29.840, AdjR² = ,067, TP = 34,6%, LM p = ,002): DAI×ICRV = +0,060</w:t>
-      </w:r>
-      <w:r>
-        <w:rPr>
-          <w:iCs/>
-          <w:i/>
-        </w:rPr>
-        <w:t xml:space="preserve">, ba chiều FSTS×DAI×ICRV = −0,001 (NS), mgr_experience = +0,009</w:t>
+        <w:t xml:space="preserve">Sai số chuẩn vững HC1. *** p &lt; ,001, ** p &lt; ,01, * p &lt; ,05, † p &lt; ,10. Biến kiểm soát (female_owner, foreign_own_pct, firm_age, ln_size) được bao gồm trong M7–M10 nhưng không báo cáo vì tiết kiệm không gian. M11 (N = 28.500, AdjR² = ,057, TP = 25,7%, LM p = ,026): DAI×ICRV = +0,052</w:t>
+      </w:r>
+      <w:r>
+        <w:rPr>
+          <w:iCs/>
+          <w:i/>
+        </w:rPr>
+        <w:t xml:space="preserve">, ba chiều FSTS×DAI×ICRV = −0,016 (NS), mgr_experience = +0,022</w:t>
       </w:r>
       <w:r>
         <w:rPr>
           <w:bCs/>
           <w:b/>
-          <w:iCs/>
-          <w:i/>
-        </w:rPr>
-        <w:t xml:space="preserve">, FSTS×mgr = −0,019†, mgr_female = +0,187</w:t>
-      </w:r>
-      <w:r>
-        <w:t xml:space="preserve">, female_owner = +0,128**.</w:t>
+        </w:rPr>
+        <w:t xml:space="preserve">, FSTS×mgr = +0,007 (NS), mgr_female = +0,210</w:t>
+      </w:r>
+      <w:r>
+        <w:t xml:space="preserve">*, female_owner = +0,122**.</w:t>
       </w:r>
     </w:p>
     <w:p>
@@ -5876,8 +6075,8 @@
         </w:pict>
       </w:r>
     </w:p>
-    <w:bookmarkEnd w:id="53"/>
-    <w:bookmarkStart w:id="54" w:name="X3bc926751b07ab6f2b9fd6ce01accecdc32b3f3"/>
+    <w:bookmarkEnd w:id="54"/>
+    <w:bookmarkStart w:id="55" w:name="X3bc926751b07ab6f2b9fd6ce01accecdc32b3f3"/>
     <w:p>
       <w:pPr>
         <w:pStyle w:val="Heading2"/>
@@ -5935,8 +6134,8 @@
         <w:t xml:space="preserve">Tác giả thứ nhất: Đỗ Thùy Hương, Trường Đại học Kỹ thuật - Công nghệ Vĩnh Long, huongdt@vlute.edu.vn, ORCID: 0000-0002-7711-2487</w:t>
       </w:r>
     </w:p>
-    <w:bookmarkEnd w:id="54"/>
     <w:bookmarkEnd w:id="55"/>
+    <w:bookmarkEnd w:id="56"/>
     <w:sectPr>
       <w:pgSz w:h="16838" w:w="11906"/>
       <w:pgMar w:bottom="1417" w:left="1417" w:right="1417" w:top="1417"/>

</xml_diff>